<commit_message>
Gives a Final Touch to mY project
</commit_message>
<xml_diff>
--- a/report/Nassau_Candy_EDA_Report.docx
+++ b/report/Nassau_Candy_EDA_Report.docx
@@ -124,7 +124,19 @@
         <w:rPr>
           <w:color w:val="2C3E50"/>
         </w:rPr>
-        <w:t>April 05, 2026</w:t>
+        <w:t xml:space="preserve">April </w:t>
+      </w:r>
+      <w:r>
+        <w:rPr>
+          <w:color w:val="2C3E50"/>
+        </w:rPr>
+        <w:t>10</w:t>
+      </w:r>
+      <w:r>
+        <w:rPr>
+          <w:color w:val="2C3E50"/>
+        </w:rPr>
+        <w:t>, 2026</w:t>
       </w:r>
     </w:p>
     <w:p>
@@ -192,7 +204,31 @@
         <w:rPr>
           <w:color w:val="2C3E50"/>
         </w:rPr>
-        <w:t>The goal was simple — find out which shipping routes are working well, which ones are causing delays, and what the company can do about it. Here is what we found at a glance:</w:t>
+        <w:t xml:space="preserve">The goal was simple — find out which shipping routes are </w:t>
+      </w:r>
+      <w:r>
+        <w:rPr>
+          <w:color w:val="2C3E50"/>
+        </w:rPr>
+        <w:t>Planned to Perform Well</w:t>
+      </w:r>
+      <w:r>
+        <w:rPr>
+          <w:color w:val="2C3E50"/>
+        </w:rPr>
+        <w:t xml:space="preserve">, which ones are </w:t>
+      </w:r>
+      <w:r>
+        <w:rPr>
+          <w:color w:val="2C3E50"/>
+        </w:rPr>
+        <w:t>Planned for</w:t>
+      </w:r>
+      <w:r>
+        <w:rPr>
+          <w:color w:val="2C3E50"/>
+        </w:rPr>
+        <w:t xml:space="preserve"> delays, and what the company can do about it. Here is what we found at a glance:</w:t>
       </w:r>
     </w:p>
     <w:p>
@@ -724,6 +760,14 @@
               </w:rPr>
               <w:t>Most Delayed Region</w:t>
             </w:r>
+            <w:r>
+              <w:rPr>
+                <w:color w:val="2C3E50"/>
+                <w:sz w:val="20"/>
+                <w:szCs w:val="20"/>
+              </w:rPr>
+              <w:t>(Planned)</w:t>
+            </w:r>
           </w:p>
         </w:tc>
         <w:tc>
@@ -810,6 +854,14 @@
               </w:rPr>
               <w:t>The Other Factory</w:t>
             </w:r>
+            <w:r>
+              <w:rPr>
+                <w:color w:val="2C3E50"/>
+                <w:sz w:val="20"/>
+                <w:szCs w:val="20"/>
+              </w:rPr>
+              <w:t>(Lowest Planned Lead Time)</w:t>
+            </w:r>
           </w:p>
         </w:tc>
       </w:tr>
@@ -867,6 +919,14 @@
                 <w:szCs w:val="20"/>
               </w:rPr>
               <w:t>Sugar Shack</w:t>
+            </w:r>
+            <w:r>
+              <w:rPr>
+                <w:color w:val="2C3E50"/>
+                <w:sz w:val="20"/>
+                <w:szCs w:val="20"/>
+              </w:rPr>
+              <w:t>(Highest Planned Lead Time)</w:t>
             </w:r>
           </w:p>
         </w:tc>
@@ -1113,13 +1173,24 @@
     </w:p>
     <w:p>
       <w:pPr>
-        <w:spacing w:before="80" w:after="80"/>
-      </w:pPr>
-      <w:r>
-        <w:rPr>
-          <w:color w:val="2C3E50"/>
-        </w:rPr>
-        <w:t>Despite having years of order and shipment data available, logistics decisions at Nassau Candy were still being made without route-level efficiency intelligence. This analysis was conducted to change that.</w:t>
+        <w:spacing w:before="100" w:after="100"/>
+        <w:rPr>
+          <w:color w:val="595959" w:themeColor="text1" w:themeTint="A6"/>
+        </w:rPr>
+      </w:pPr>
+    </w:p>
+    <w:p>
+      <w:pPr>
+        <w:spacing w:before="100" w:after="100"/>
+        <w:rPr>
+          <w:color w:val="595959" w:themeColor="text1" w:themeTint="A6"/>
+        </w:rPr>
+      </w:pPr>
+      <w:r>
+        <w:rPr>
+          <w:color w:val="595959" w:themeColor="text1" w:themeTint="A6"/>
+        </w:rPr>
+        <w:t>Despite having two years of detailed order and shipment planning data, Nassau Candy had no systematic way to evaluate which routes were planned to perform well and which were at risk. This analysis builds that visibility from scratch.</w:t>
       </w:r>
     </w:p>
     <w:p>
@@ -1151,103 +1222,117 @@
     </w:p>
     <w:p>
       <w:pPr>
+        <w:numPr>
+          <w:ilvl w:val="0"/>
+          <w:numId w:val="5"/>
+        </w:numPr>
         <w:spacing w:before="100" w:after="100"/>
-      </w:pPr>
+        <w:rPr>
+          <w:color w:val="595959" w:themeColor="text1" w:themeTint="A6"/>
+        </w:rPr>
+      </w:pPr>
+      <w:r>
+        <w:rPr>
+          <w:color w:val="595959" w:themeColor="text1" w:themeTint="A6"/>
+        </w:rPr>
+        <w:t>Which factory-to-customer routes are planned to be fastest and most reliable?</w:t>
+      </w:r>
+    </w:p>
+    <w:p>
+      <w:pPr>
+        <w:numPr>
+          <w:ilvl w:val="0"/>
+          <w:numId w:val="5"/>
+        </w:numPr>
+        <w:spacing w:before="100" w:after="100"/>
+        <w:rPr>
+          <w:color w:val="595959" w:themeColor="text1" w:themeTint="A6"/>
+        </w:rPr>
+      </w:pPr>
+      <w:r>
+        <w:rPr>
+          <w:color w:val="595959" w:themeColor="text1" w:themeTint="A6"/>
+        </w:rPr>
+        <w:t>Which routes are projected to have the longest lead times and need attention?</w:t>
+      </w:r>
+    </w:p>
+    <w:p>
+      <w:pPr>
+        <w:numPr>
+          <w:ilvl w:val="0"/>
+          <w:numId w:val="5"/>
+        </w:numPr>
+        <w:spacing w:before="100" w:after="100"/>
+        <w:rPr>
+          <w:color w:val="595959" w:themeColor="text1" w:themeTint="A6"/>
+        </w:rPr>
+      </w:pPr>
+      <w:r>
+        <w:rPr>
+          <w:color w:val="595959" w:themeColor="text1" w:themeTint="A6"/>
+        </w:rPr>
+        <w:t>Does planned shipping performance vary significantly by region, state, or ship mode?</w:t>
+      </w:r>
+    </w:p>
+    <w:p>
+      <w:pPr>
+        <w:numPr>
+          <w:ilvl w:val="0"/>
+          <w:numId w:val="5"/>
+        </w:numPr>
+        <w:spacing w:before="100" w:after="100"/>
+        <w:rPr>
+          <w:color w:val="595959" w:themeColor="text1" w:themeTint="A6"/>
+        </w:rPr>
+      </w:pPr>
+      <w:r>
+        <w:rPr>
+          <w:color w:val="595959" w:themeColor="text1" w:themeTint="A6"/>
+        </w:rPr>
+        <w:t>Where in the country are the biggest geographic bottlenecks in the plan?</w:t>
+      </w:r>
     </w:p>
     <w:p>
       <w:pPr>
         <w:pStyle w:val="ListParagraph"/>
         <w:numPr>
           <w:ilvl w:val="0"/>
-          <w:numId w:val="2"/>
+          <w:numId w:val="5"/>
         </w:numPr>
-        <w:spacing w:before="60" w:after="60"/>
-      </w:pPr>
-      <w:r>
-        <w:rPr>
-          <w:color w:val="2C3E50"/>
-        </w:rPr>
-        <w:t>Which factory-to-customer routes are consistently fast and reliable?</w:t>
-      </w:r>
-    </w:p>
-    <w:p>
-      <w:pPr>
-        <w:pStyle w:val="ListParagraph"/>
-        <w:numPr>
-          <w:ilvl w:val="0"/>
-          <w:numId w:val="2"/>
-        </w:numPr>
-        <w:spacing w:before="60" w:after="60"/>
-      </w:pPr>
-      <w:r>
-        <w:rPr>
-          <w:color w:val="2C3E50"/>
-        </w:rPr>
-        <w:t>Which routes are frequently delayed and need urgent attention?</w:t>
-      </w:r>
-    </w:p>
-    <w:p>
-      <w:pPr>
-        <w:pStyle w:val="ListParagraph"/>
-        <w:numPr>
-          <w:ilvl w:val="0"/>
-          <w:numId w:val="2"/>
-        </w:numPr>
-        <w:spacing w:before="60" w:after="60"/>
-      </w:pPr>
-      <w:r>
-        <w:rPr>
-          <w:color w:val="2C3E50"/>
-        </w:rPr>
-        <w:t>Does shipping performance vary significantly by region, state, or ship mode?</w:t>
-      </w:r>
-    </w:p>
-    <w:p>
-      <w:pPr>
-        <w:pStyle w:val="ListParagraph"/>
-        <w:numPr>
-          <w:ilvl w:val="0"/>
-          <w:numId w:val="2"/>
-        </w:numPr>
-        <w:spacing w:before="60" w:after="60"/>
-      </w:pPr>
-      <w:r>
-        <w:rPr>
-          <w:color w:val="2C3E50"/>
-        </w:rPr>
-        <w:t>Where in the country are the biggest geographic bottlenecks?</w:t>
-      </w:r>
-    </w:p>
-    <w:p>
-      <w:pPr>
-        <w:pStyle w:val="ListParagraph"/>
-        <w:numPr>
-          <w:ilvl w:val="0"/>
-          <w:numId w:val="2"/>
-        </w:numPr>
-        <w:spacing w:before="60" w:after="60"/>
-      </w:pPr>
-      <w:r>
-        <w:rPr>
-          <w:color w:val="2C3E50"/>
-        </w:rPr>
-        <w:t>Is paying more for premium shipping actually worth it?</w:t>
-      </w:r>
-    </w:p>
-    <w:p>
-      <w:pPr>
         <w:spacing w:before="100" w:after="100"/>
-      </w:pPr>
-    </w:p>
-    <w:p>
-      <w:pPr>
-        <w:spacing w:before="80" w:after="80"/>
-      </w:pPr>
-      <w:r>
-        <w:rPr>
-          <w:color w:val="2C3E50"/>
-        </w:rPr>
-        <w:t>Without visibility into these questions, the logistics team was forced to react to problems after they happened rather than preventing them in the first place. This analysis addresses each of these gaps systematically using data-driven methods.</w:t>
+        <w:rPr>
+          <w:color w:val="595959" w:themeColor="text1" w:themeTint="A6"/>
+        </w:rPr>
+      </w:pPr>
+      <w:r>
+        <w:rPr>
+          <w:color w:val="595959" w:themeColor="text1" w:themeTint="A6"/>
+        </w:rPr>
+        <w:t>Is paying more for premium shipping (First Class, Same Day) actually worth it</w:t>
+      </w:r>
+    </w:p>
+    <w:p>
+      <w:pPr>
+        <w:spacing w:before="100" w:after="100"/>
+      </w:pPr>
+    </w:p>
+    <w:p>
+      <w:pPr>
+        <w:spacing w:before="100" w:after="100"/>
+      </w:pPr>
+    </w:p>
+    <w:p>
+      <w:pPr>
+        <w:spacing w:before="100" w:after="100"/>
+        <w:rPr>
+          <w:color w:val="7F7F7F" w:themeColor="text1" w:themeTint="80"/>
+        </w:rPr>
+      </w:pPr>
+      <w:r>
+        <w:rPr>
+          <w:color w:val="7F7F7F" w:themeColor="text1" w:themeTint="80"/>
+        </w:rPr>
+        <w:t>Without answers to these questions, logistics decisions remain reactive — problems get noticed only after they have already affected customers. This analysis gives Nassau Candy the tools to be proactive instead.</w:t>
       </w:r>
     </w:p>
     <w:p>
@@ -1319,10 +1404,10 @@
           <w:tcPr>
             <w:tcW w:w="4680" w:type="dxa"/>
             <w:tcBorders>
-              <w:top w:val="single" w:sz="1" w:space="0" w:color="CCCCCC"/>
-              <w:left w:val="single" w:sz="1" w:space="0" w:color="CCCCCC"/>
-              <w:bottom w:val="single" w:sz="1" w:space="0" w:color="CCCCCC"/>
-              <w:right w:val="single" w:sz="1" w:space="0" w:color="CCCCCC"/>
+              <w:top w:val="single" w:sz="2" w:space="0" w:color="CCCCCC"/>
+              <w:left w:val="single" w:sz="2" w:space="0" w:color="CCCCCC"/>
+              <w:bottom w:val="single" w:sz="2" w:space="0" w:color="CCCCCC"/>
+              <w:right w:val="single" w:sz="2" w:space="0" w:color="CCCCCC"/>
             </w:tcBorders>
             <w:shd w:val="clear" w:color="auto" w:fill="2E75B6"/>
             <w:tcMar>
@@ -1331,18 +1416,16 @@
               <w:bottom w:w="80" w:type="dxa"/>
               <w:right w:w="120" w:type="dxa"/>
             </w:tcMar>
+            <w:hideMark/>
           </w:tcPr>
           <w:p>
             <w:pPr>
-              <w:jc w:val="center"/>
+              <w:spacing w:before="100" w:after="100"/>
             </w:pPr>
             <w:r>
               <w:rPr>
                 <w:b/>
                 <w:bCs/>
-                <w:color w:val="FFFFFF"/>
-                <w:sz w:val="20"/>
-                <w:szCs w:val="20"/>
               </w:rPr>
               <w:t>Attribute</w:t>
             </w:r>
@@ -1352,10 +1435,10 @@
           <w:tcPr>
             <w:tcW w:w="4680" w:type="dxa"/>
             <w:tcBorders>
-              <w:top w:val="single" w:sz="1" w:space="0" w:color="CCCCCC"/>
-              <w:left w:val="single" w:sz="1" w:space="0" w:color="CCCCCC"/>
-              <w:bottom w:val="single" w:sz="1" w:space="0" w:color="CCCCCC"/>
-              <w:right w:val="single" w:sz="1" w:space="0" w:color="CCCCCC"/>
+              <w:top w:val="single" w:sz="2" w:space="0" w:color="CCCCCC"/>
+              <w:left w:val="single" w:sz="2" w:space="0" w:color="CCCCCC"/>
+              <w:bottom w:val="single" w:sz="2" w:space="0" w:color="CCCCCC"/>
+              <w:right w:val="single" w:sz="2" w:space="0" w:color="CCCCCC"/>
             </w:tcBorders>
             <w:shd w:val="clear" w:color="auto" w:fill="2E75B6"/>
             <w:tcMar>
@@ -1364,18 +1447,16 @@
               <w:bottom w:w="80" w:type="dxa"/>
               <w:right w:w="120" w:type="dxa"/>
             </w:tcMar>
+            <w:hideMark/>
           </w:tcPr>
           <w:p>
             <w:pPr>
-              <w:jc w:val="center"/>
+              <w:spacing w:before="100" w:after="100"/>
             </w:pPr>
             <w:r>
               <w:rPr>
                 <w:b/>
                 <w:bCs/>
-                <w:color w:val="FFFFFF"/>
-                <w:sz w:val="20"/>
-                <w:szCs w:val="20"/>
               </w:rPr>
               <w:t>Value</w:t>
             </w:r>
@@ -1387,10 +1468,10 @@
           <w:tcPr>
             <w:tcW w:w="4680" w:type="dxa"/>
             <w:tcBorders>
-              <w:top w:val="single" w:sz="1" w:space="0" w:color="CCCCCC"/>
-              <w:left w:val="single" w:sz="1" w:space="0" w:color="CCCCCC"/>
-              <w:bottom w:val="single" w:sz="1" w:space="0" w:color="CCCCCC"/>
-              <w:right w:val="single" w:sz="1" w:space="0" w:color="CCCCCC"/>
+              <w:top w:val="single" w:sz="2" w:space="0" w:color="CCCCCC"/>
+              <w:left w:val="single" w:sz="2" w:space="0" w:color="CCCCCC"/>
+              <w:bottom w:val="single" w:sz="2" w:space="0" w:color="CCCCCC"/>
+              <w:right w:val="single" w:sz="2" w:space="0" w:color="CCCCCC"/>
             </w:tcBorders>
             <w:shd w:val="clear" w:color="auto" w:fill="FFFFFF"/>
             <w:tcMar>
@@ -1399,14 +1480,13 @@
               <w:bottom w:w="80" w:type="dxa"/>
               <w:right w:w="120" w:type="dxa"/>
             </w:tcMar>
-          </w:tcPr>
-          <w:p>
-            <w:r>
-              <w:rPr>
-                <w:color w:val="2C3E50"/>
-                <w:sz w:val="20"/>
-                <w:szCs w:val="20"/>
-              </w:rPr>
+            <w:hideMark/>
+          </w:tcPr>
+          <w:p>
+            <w:pPr>
+              <w:spacing w:before="100" w:after="100"/>
+            </w:pPr>
+            <w:r>
               <w:t>Total Records (Rows)</w:t>
             </w:r>
           </w:p>
@@ -1415,10 +1495,10 @@
           <w:tcPr>
             <w:tcW w:w="4680" w:type="dxa"/>
             <w:tcBorders>
-              <w:top w:val="single" w:sz="1" w:space="0" w:color="CCCCCC"/>
-              <w:left w:val="single" w:sz="1" w:space="0" w:color="CCCCCC"/>
-              <w:bottom w:val="single" w:sz="1" w:space="0" w:color="CCCCCC"/>
-              <w:right w:val="single" w:sz="1" w:space="0" w:color="CCCCCC"/>
+              <w:top w:val="single" w:sz="2" w:space="0" w:color="CCCCCC"/>
+              <w:left w:val="single" w:sz="2" w:space="0" w:color="CCCCCC"/>
+              <w:bottom w:val="single" w:sz="2" w:space="0" w:color="CCCCCC"/>
+              <w:right w:val="single" w:sz="2" w:space="0" w:color="CCCCCC"/>
             </w:tcBorders>
             <w:shd w:val="clear" w:color="auto" w:fill="FFFFFF"/>
             <w:tcMar>
@@ -1427,14 +1507,13 @@
               <w:bottom w:w="80" w:type="dxa"/>
               <w:right w:w="120" w:type="dxa"/>
             </w:tcMar>
-          </w:tcPr>
-          <w:p>
-            <w:r>
-              <w:rPr>
-                <w:color w:val="2C3E50"/>
-                <w:sz w:val="20"/>
-                <w:szCs w:val="20"/>
-              </w:rPr>
+            <w:hideMark/>
+          </w:tcPr>
+          <w:p>
+            <w:pPr>
+              <w:spacing w:before="100" w:after="100"/>
+            </w:pPr>
+            <w:r>
               <w:t>10,194 orders</w:t>
             </w:r>
           </w:p>
@@ -1445,10 +1524,10 @@
           <w:tcPr>
             <w:tcW w:w="4680" w:type="dxa"/>
             <w:tcBorders>
-              <w:top w:val="single" w:sz="1" w:space="0" w:color="CCCCCC"/>
-              <w:left w:val="single" w:sz="1" w:space="0" w:color="CCCCCC"/>
-              <w:bottom w:val="single" w:sz="1" w:space="0" w:color="CCCCCC"/>
-              <w:right w:val="single" w:sz="1" w:space="0" w:color="CCCCCC"/>
+              <w:top w:val="single" w:sz="2" w:space="0" w:color="CCCCCC"/>
+              <w:left w:val="single" w:sz="2" w:space="0" w:color="CCCCCC"/>
+              <w:bottom w:val="single" w:sz="2" w:space="0" w:color="CCCCCC"/>
+              <w:right w:val="single" w:sz="2" w:space="0" w:color="CCCCCC"/>
             </w:tcBorders>
             <w:shd w:val="clear" w:color="auto" w:fill="F2F3F4"/>
             <w:tcMar>
@@ -1457,14 +1536,13 @@
               <w:bottom w:w="80" w:type="dxa"/>
               <w:right w:w="120" w:type="dxa"/>
             </w:tcMar>
-          </w:tcPr>
-          <w:p>
-            <w:r>
-              <w:rPr>
-                <w:color w:val="2C3E50"/>
-                <w:sz w:val="20"/>
-                <w:szCs w:val="20"/>
-              </w:rPr>
+            <w:hideMark/>
+          </w:tcPr>
+          <w:p>
+            <w:pPr>
+              <w:spacing w:before="100" w:after="100"/>
+            </w:pPr>
+            <w:r>
               <w:t>Total Features (Columns)</w:t>
             </w:r>
           </w:p>
@@ -1473,10 +1551,10 @@
           <w:tcPr>
             <w:tcW w:w="4680" w:type="dxa"/>
             <w:tcBorders>
-              <w:top w:val="single" w:sz="1" w:space="0" w:color="CCCCCC"/>
-              <w:left w:val="single" w:sz="1" w:space="0" w:color="CCCCCC"/>
-              <w:bottom w:val="single" w:sz="1" w:space="0" w:color="CCCCCC"/>
-              <w:right w:val="single" w:sz="1" w:space="0" w:color="CCCCCC"/>
+              <w:top w:val="single" w:sz="2" w:space="0" w:color="CCCCCC"/>
+              <w:left w:val="single" w:sz="2" w:space="0" w:color="CCCCCC"/>
+              <w:bottom w:val="single" w:sz="2" w:space="0" w:color="CCCCCC"/>
+              <w:right w:val="single" w:sz="2" w:space="0" w:color="CCCCCC"/>
             </w:tcBorders>
             <w:shd w:val="clear" w:color="auto" w:fill="F2F3F4"/>
             <w:tcMar>
@@ -1485,15 +1563,14 @@
               <w:bottom w:w="80" w:type="dxa"/>
               <w:right w:w="120" w:type="dxa"/>
             </w:tcMar>
-          </w:tcPr>
-          <w:p>
-            <w:r>
-              <w:rPr>
-                <w:color w:val="2C3E50"/>
-                <w:sz w:val="20"/>
-                <w:szCs w:val="20"/>
-              </w:rPr>
-              <w:t>23 fields</w:t>
+            <w:hideMark/>
+          </w:tcPr>
+          <w:p>
+            <w:pPr>
+              <w:spacing w:before="100" w:after="100"/>
+            </w:pPr>
+            <w:r>
+              <w:t>19 original + 3 engineered = 22 total</w:t>
             </w:r>
           </w:p>
         </w:tc>
@@ -1503,10 +1580,10 @@
           <w:tcPr>
             <w:tcW w:w="4680" w:type="dxa"/>
             <w:tcBorders>
-              <w:top w:val="single" w:sz="1" w:space="0" w:color="CCCCCC"/>
-              <w:left w:val="single" w:sz="1" w:space="0" w:color="CCCCCC"/>
-              <w:bottom w:val="single" w:sz="1" w:space="0" w:color="CCCCCC"/>
-              <w:right w:val="single" w:sz="1" w:space="0" w:color="CCCCCC"/>
+              <w:top w:val="single" w:sz="2" w:space="0" w:color="CCCCCC"/>
+              <w:left w:val="single" w:sz="2" w:space="0" w:color="CCCCCC"/>
+              <w:bottom w:val="single" w:sz="2" w:space="0" w:color="CCCCCC"/>
+              <w:right w:val="single" w:sz="2" w:space="0" w:color="CCCCCC"/>
             </w:tcBorders>
             <w:shd w:val="clear" w:color="auto" w:fill="FFFFFF"/>
             <w:tcMar>
@@ -1515,14 +1592,14 @@
               <w:bottom w:w="80" w:type="dxa"/>
               <w:right w:w="120" w:type="dxa"/>
             </w:tcMar>
-          </w:tcPr>
-          <w:p>
-            <w:r>
-              <w:rPr>
-                <w:color w:val="2C3E50"/>
-                <w:sz w:val="20"/>
-                <w:szCs w:val="20"/>
-              </w:rPr>
+            <w:hideMark/>
+          </w:tcPr>
+          <w:p>
+            <w:pPr>
+              <w:spacing w:before="100" w:after="100"/>
+            </w:pPr>
+            <w:r>
+              <w:lastRenderedPageBreak/>
               <w:t>Earliest Order Date</w:t>
             </w:r>
           </w:p>
@@ -1531,10 +1608,10 @@
           <w:tcPr>
             <w:tcW w:w="4680" w:type="dxa"/>
             <w:tcBorders>
-              <w:top w:val="single" w:sz="1" w:space="0" w:color="CCCCCC"/>
-              <w:left w:val="single" w:sz="1" w:space="0" w:color="CCCCCC"/>
-              <w:bottom w:val="single" w:sz="1" w:space="0" w:color="CCCCCC"/>
-              <w:right w:val="single" w:sz="1" w:space="0" w:color="CCCCCC"/>
+              <w:top w:val="single" w:sz="2" w:space="0" w:color="CCCCCC"/>
+              <w:left w:val="single" w:sz="2" w:space="0" w:color="CCCCCC"/>
+              <w:bottom w:val="single" w:sz="2" w:space="0" w:color="CCCCCC"/>
+              <w:right w:val="single" w:sz="2" w:space="0" w:color="CCCCCC"/>
             </w:tcBorders>
             <w:shd w:val="clear" w:color="auto" w:fill="FFFFFF"/>
             <w:tcMar>
@@ -1543,14 +1620,13 @@
               <w:bottom w:w="80" w:type="dxa"/>
               <w:right w:w="120" w:type="dxa"/>
             </w:tcMar>
-          </w:tcPr>
-          <w:p>
-            <w:r>
-              <w:rPr>
-                <w:color w:val="2C3E50"/>
-                <w:sz w:val="20"/>
-                <w:szCs w:val="20"/>
-              </w:rPr>
+            <w:hideMark/>
+          </w:tcPr>
+          <w:p>
+            <w:pPr>
+              <w:spacing w:before="100" w:after="100"/>
+            </w:pPr>
+            <w:r>
               <w:t>January 02, 2024</w:t>
             </w:r>
           </w:p>
@@ -1561,10 +1637,10 @@
           <w:tcPr>
             <w:tcW w:w="4680" w:type="dxa"/>
             <w:tcBorders>
-              <w:top w:val="single" w:sz="1" w:space="0" w:color="CCCCCC"/>
-              <w:left w:val="single" w:sz="1" w:space="0" w:color="CCCCCC"/>
-              <w:bottom w:val="single" w:sz="1" w:space="0" w:color="CCCCCC"/>
-              <w:right w:val="single" w:sz="1" w:space="0" w:color="CCCCCC"/>
+              <w:top w:val="single" w:sz="2" w:space="0" w:color="CCCCCC"/>
+              <w:left w:val="single" w:sz="2" w:space="0" w:color="CCCCCC"/>
+              <w:bottom w:val="single" w:sz="2" w:space="0" w:color="CCCCCC"/>
+              <w:right w:val="single" w:sz="2" w:space="0" w:color="CCCCCC"/>
             </w:tcBorders>
             <w:shd w:val="clear" w:color="auto" w:fill="F2F3F4"/>
             <w:tcMar>
@@ -1573,14 +1649,13 @@
               <w:bottom w:w="80" w:type="dxa"/>
               <w:right w:w="120" w:type="dxa"/>
             </w:tcMar>
-          </w:tcPr>
-          <w:p>
-            <w:r>
-              <w:rPr>
-                <w:color w:val="2C3E50"/>
-                <w:sz w:val="20"/>
-                <w:szCs w:val="20"/>
-              </w:rPr>
+            <w:hideMark/>
+          </w:tcPr>
+          <w:p>
+            <w:pPr>
+              <w:spacing w:before="100" w:after="100"/>
+            </w:pPr>
+            <w:r>
               <w:t>Latest Order Date</w:t>
             </w:r>
           </w:p>
@@ -1589,10 +1664,10 @@
           <w:tcPr>
             <w:tcW w:w="4680" w:type="dxa"/>
             <w:tcBorders>
-              <w:top w:val="single" w:sz="1" w:space="0" w:color="CCCCCC"/>
-              <w:left w:val="single" w:sz="1" w:space="0" w:color="CCCCCC"/>
-              <w:bottom w:val="single" w:sz="1" w:space="0" w:color="CCCCCC"/>
-              <w:right w:val="single" w:sz="1" w:space="0" w:color="CCCCCC"/>
+              <w:top w:val="single" w:sz="2" w:space="0" w:color="CCCCCC"/>
+              <w:left w:val="single" w:sz="2" w:space="0" w:color="CCCCCC"/>
+              <w:bottom w:val="single" w:sz="2" w:space="0" w:color="CCCCCC"/>
+              <w:right w:val="single" w:sz="2" w:space="0" w:color="CCCCCC"/>
             </w:tcBorders>
             <w:shd w:val="clear" w:color="auto" w:fill="F2F3F4"/>
             <w:tcMar>
@@ -1601,14 +1676,13 @@
               <w:bottom w:w="80" w:type="dxa"/>
               <w:right w:w="120" w:type="dxa"/>
             </w:tcMar>
-          </w:tcPr>
-          <w:p>
-            <w:r>
-              <w:rPr>
-                <w:color w:val="2C3E50"/>
-                <w:sz w:val="20"/>
-                <w:szCs w:val="20"/>
-              </w:rPr>
+            <w:hideMark/>
+          </w:tcPr>
+          <w:p>
+            <w:pPr>
+              <w:spacing w:before="100" w:after="100"/>
+            </w:pPr>
+            <w:r>
               <w:t>December 31, 2025</w:t>
             </w:r>
           </w:p>
@@ -1619,10 +1693,10 @@
           <w:tcPr>
             <w:tcW w:w="4680" w:type="dxa"/>
             <w:tcBorders>
-              <w:top w:val="single" w:sz="1" w:space="0" w:color="CCCCCC"/>
-              <w:left w:val="single" w:sz="1" w:space="0" w:color="CCCCCC"/>
-              <w:bottom w:val="single" w:sz="1" w:space="0" w:color="CCCCCC"/>
-              <w:right w:val="single" w:sz="1" w:space="0" w:color="CCCCCC"/>
+              <w:top w:val="single" w:sz="2" w:space="0" w:color="CCCCCC"/>
+              <w:left w:val="single" w:sz="2" w:space="0" w:color="CCCCCC"/>
+              <w:bottom w:val="single" w:sz="2" w:space="0" w:color="CCCCCC"/>
+              <w:right w:val="single" w:sz="2" w:space="0" w:color="CCCCCC"/>
             </w:tcBorders>
             <w:shd w:val="clear" w:color="auto" w:fill="FFFFFF"/>
             <w:tcMar>
@@ -1631,15 +1705,14 @@
               <w:bottom w:w="80" w:type="dxa"/>
               <w:right w:w="120" w:type="dxa"/>
             </w:tcMar>
-          </w:tcPr>
-          <w:p>
-            <w:r>
-              <w:rPr>
-                <w:color w:val="2C3E50"/>
-                <w:sz w:val="20"/>
-                <w:szCs w:val="20"/>
-              </w:rPr>
-              <w:t>Time Period Covered</w:t>
+            <w:hideMark/>
+          </w:tcPr>
+          <w:p>
+            <w:pPr>
+              <w:spacing w:before="100" w:after="100"/>
+            </w:pPr>
+            <w:r>
+              <w:t>Earliest Planned Ship Date</w:t>
             </w:r>
           </w:p>
         </w:tc>
@@ -1647,10 +1720,10 @@
           <w:tcPr>
             <w:tcW w:w="4680" w:type="dxa"/>
             <w:tcBorders>
-              <w:top w:val="single" w:sz="1" w:space="0" w:color="CCCCCC"/>
-              <w:left w:val="single" w:sz="1" w:space="0" w:color="CCCCCC"/>
-              <w:bottom w:val="single" w:sz="1" w:space="0" w:color="CCCCCC"/>
-              <w:right w:val="single" w:sz="1" w:space="0" w:color="CCCCCC"/>
+              <w:top w:val="single" w:sz="2" w:space="0" w:color="CCCCCC"/>
+              <w:left w:val="single" w:sz="2" w:space="0" w:color="CCCCCC"/>
+              <w:bottom w:val="single" w:sz="2" w:space="0" w:color="CCCCCC"/>
+              <w:right w:val="single" w:sz="2" w:space="0" w:color="CCCCCC"/>
             </w:tcBorders>
             <w:shd w:val="clear" w:color="auto" w:fill="FFFFFF"/>
             <w:tcMar>
@@ -1659,20 +1732,149 @@
               <w:bottom w:w="80" w:type="dxa"/>
               <w:right w:w="120" w:type="dxa"/>
             </w:tcMar>
-          </w:tcPr>
-          <w:p>
-            <w:r>
-              <w:rPr>
-                <w:color w:val="2C3E50"/>
-                <w:sz w:val="20"/>
-                <w:szCs w:val="20"/>
-              </w:rPr>
+            <w:hideMark/>
+          </w:tcPr>
+          <w:p>
+            <w:pPr>
+              <w:spacing w:before="100" w:after="100"/>
+            </w:pPr>
+            <w:r>
+              <w:t>June 2026</w:t>
+            </w:r>
+          </w:p>
+        </w:tc>
+      </w:tr>
+      <w:tr>
+        <w:tc>
+          <w:tcPr>
+            <w:tcW w:w="4680" w:type="dxa"/>
+            <w:tcBorders>
+              <w:top w:val="single" w:sz="2" w:space="0" w:color="CCCCCC"/>
+              <w:left w:val="single" w:sz="2" w:space="0" w:color="CCCCCC"/>
+              <w:bottom w:val="single" w:sz="2" w:space="0" w:color="CCCCCC"/>
+              <w:right w:val="single" w:sz="2" w:space="0" w:color="CCCCCC"/>
+            </w:tcBorders>
+            <w:shd w:val="clear" w:color="auto" w:fill="F2F3F4"/>
+            <w:tcMar>
+              <w:top w:w="80" w:type="dxa"/>
+              <w:left w:w="120" w:type="dxa"/>
+              <w:bottom w:w="80" w:type="dxa"/>
+              <w:right w:w="120" w:type="dxa"/>
+            </w:tcMar>
+            <w:hideMark/>
+          </w:tcPr>
+          <w:p>
+            <w:pPr>
+              <w:spacing w:before="100" w:after="100"/>
+            </w:pPr>
+            <w:r>
+              <w:t>Latest Planned Ship Date</w:t>
+            </w:r>
+          </w:p>
+        </w:tc>
+        <w:tc>
+          <w:tcPr>
+            <w:tcW w:w="4680" w:type="dxa"/>
+            <w:tcBorders>
+              <w:top w:val="single" w:sz="2" w:space="0" w:color="CCCCCC"/>
+              <w:left w:val="single" w:sz="2" w:space="0" w:color="CCCCCC"/>
+              <w:bottom w:val="single" w:sz="2" w:space="0" w:color="CCCCCC"/>
+              <w:right w:val="single" w:sz="2" w:space="0" w:color="CCCCCC"/>
+            </w:tcBorders>
+            <w:shd w:val="clear" w:color="auto" w:fill="F2F3F4"/>
+            <w:tcMar>
+              <w:top w:w="80" w:type="dxa"/>
+              <w:left w:w="120" w:type="dxa"/>
+              <w:bottom w:w="80" w:type="dxa"/>
+              <w:right w:w="120" w:type="dxa"/>
+            </w:tcMar>
+            <w:hideMark/>
+          </w:tcPr>
+          <w:p>
+            <w:pPr>
+              <w:spacing w:before="100" w:after="100"/>
+            </w:pPr>
+            <w:r>
+              <w:t>June 2030</w:t>
+            </w:r>
+          </w:p>
+        </w:tc>
+      </w:tr>
+      <w:tr>
+        <w:tc>
+          <w:tcPr>
+            <w:tcW w:w="4680" w:type="dxa"/>
+            <w:tcBorders>
+              <w:top w:val="single" w:sz="2" w:space="0" w:color="CCCCCC"/>
+              <w:left w:val="single" w:sz="2" w:space="0" w:color="CCCCCC"/>
+              <w:bottom w:val="single" w:sz="2" w:space="0" w:color="CCCCCC"/>
+              <w:right w:val="single" w:sz="2" w:space="0" w:color="CCCCCC"/>
+            </w:tcBorders>
+            <w:shd w:val="clear" w:color="auto" w:fill="FFFFFF"/>
+            <w:tcMar>
+              <w:top w:w="80" w:type="dxa"/>
+              <w:left w:w="120" w:type="dxa"/>
+              <w:bottom w:w="80" w:type="dxa"/>
+              <w:right w:w="120" w:type="dxa"/>
+            </w:tcMar>
+            <w:hideMark/>
+          </w:tcPr>
+          <w:p>
+            <w:pPr>
+              <w:spacing w:before="100" w:after="100"/>
+            </w:pPr>
+            <w:r>
+              <w:t>Time Period of Orders</w:t>
+            </w:r>
+          </w:p>
+        </w:tc>
+        <w:tc>
+          <w:tcPr>
+            <w:tcW w:w="4680" w:type="dxa"/>
+            <w:tcBorders>
+              <w:top w:val="single" w:sz="2" w:space="0" w:color="CCCCCC"/>
+              <w:left w:val="single" w:sz="2" w:space="0" w:color="CCCCCC"/>
+              <w:bottom w:val="single" w:sz="2" w:space="0" w:color="CCCCCC"/>
+              <w:right w:val="single" w:sz="2" w:space="0" w:color="CCCCCC"/>
+            </w:tcBorders>
+            <w:shd w:val="clear" w:color="auto" w:fill="FFFFFF"/>
+            <w:tcMar>
+              <w:top w:w="80" w:type="dxa"/>
+              <w:left w:w="120" w:type="dxa"/>
+              <w:bottom w:w="80" w:type="dxa"/>
+              <w:right w:w="120" w:type="dxa"/>
+            </w:tcMar>
+            <w:hideMark/>
+          </w:tcPr>
+          <w:p>
+            <w:pPr>
+              <w:spacing w:before="100" w:after="100"/>
+            </w:pPr>
+            <w:r>
               <w:t>729 days (approximately 2 years)</w:t>
             </w:r>
           </w:p>
         </w:tc>
       </w:tr>
     </w:tbl>
+    <w:p>
+      <w:pPr>
+        <w:spacing w:before="100" w:after="100"/>
+      </w:pPr>
+    </w:p>
+    <w:p>
+      <w:pPr>
+        <w:spacing w:before="100" w:after="100"/>
+      </w:pPr>
+      <w:r>
+        <w:rPr>
+          <w:i/>
+          <w:iCs/>
+          <w:highlight w:val="lightGray"/>
+        </w:rPr>
+        <w:t>Key clarification: Because Ship Dates are planned future dates, the lead times in this dataset (ranging from 904 to 1,642 days) represent the planned time between order placement and scheduled delivery — not actual historical shipping durations.</w:t>
+      </w:r>
+    </w:p>
     <w:p>
       <w:pPr>
         <w:spacing w:before="100" w:after="100"/>
@@ -1926,6 +2128,14 @@
               </w:rPr>
               <w:t>Unique States and Provinces</w:t>
             </w:r>
+            <w:r>
+              <w:rPr>
+                <w:color w:val="2C3E50"/>
+                <w:sz w:val="20"/>
+                <w:szCs w:val="20"/>
+              </w:rPr>
+              <w:t>(US+Canada)</w:t>
+            </w:r>
           </w:p>
         </w:tc>
         <w:tc>
@@ -2074,6 +2284,9 @@
         </w:tc>
       </w:tr>
       <w:tr>
+        <w:trPr>
+          <w:trHeight w:val="311"/>
+        </w:trPr>
         <w:tc>
           <w:tcPr>
             <w:tcW w:w="4680" w:type="dxa"/>
@@ -2120,6 +2333,13 @@
             </w:tcMar>
           </w:tcPr>
           <w:p>
+            <w:pPr>
+              <w:rPr>
+                <w:color w:val="2C3E50"/>
+                <w:sz w:val="20"/>
+                <w:szCs w:val="20"/>
+              </w:rPr>
+            </w:pPr>
             <w:r>
               <w:rPr>
                 <w:color w:val="2C3E50"/>
@@ -2127,6 +2347,81 @@
                 <w:szCs w:val="20"/>
               </w:rPr>
               <w:t>5</w:t>
+            </w:r>
+          </w:p>
+        </w:tc>
+      </w:tr>
+      <w:tr>
+        <w:trPr>
+          <w:trHeight w:val="311"/>
+        </w:trPr>
+        <w:tc>
+          <w:tcPr>
+            <w:tcW w:w="4680" w:type="dxa"/>
+            <w:tcBorders>
+              <w:top w:val="single" w:sz="1" w:space="0" w:color="CCCCCC"/>
+              <w:left w:val="single" w:sz="1" w:space="0" w:color="CCCCCC"/>
+              <w:bottom w:val="single" w:sz="1" w:space="0" w:color="CCCCCC"/>
+              <w:right w:val="single" w:sz="1" w:space="0" w:color="CCCCCC"/>
+            </w:tcBorders>
+            <w:shd w:val="clear" w:color="auto" w:fill="F2F3F4"/>
+            <w:tcMar>
+              <w:top w:w="80" w:type="dxa"/>
+              <w:left w:w="120" w:type="dxa"/>
+              <w:bottom w:w="80" w:type="dxa"/>
+              <w:right w:w="120" w:type="dxa"/>
+            </w:tcMar>
+          </w:tcPr>
+          <w:p>
+            <w:pPr>
+              <w:rPr>
+                <w:color w:val="2C3E50"/>
+                <w:sz w:val="20"/>
+                <w:szCs w:val="20"/>
+              </w:rPr>
+            </w:pPr>
+            <w:r>
+              <w:rPr>
+                <w:color w:val="2C3E50"/>
+                <w:sz w:val="20"/>
+                <w:szCs w:val="20"/>
+              </w:rPr>
+              <w:t>Average Orders per Month</w:t>
+            </w:r>
+          </w:p>
+        </w:tc>
+        <w:tc>
+          <w:tcPr>
+            <w:tcW w:w="4680" w:type="dxa"/>
+            <w:tcBorders>
+              <w:top w:val="single" w:sz="1" w:space="0" w:color="CCCCCC"/>
+              <w:left w:val="single" w:sz="1" w:space="0" w:color="CCCCCC"/>
+              <w:bottom w:val="single" w:sz="1" w:space="0" w:color="CCCCCC"/>
+              <w:right w:val="single" w:sz="1" w:space="0" w:color="CCCCCC"/>
+            </w:tcBorders>
+            <w:shd w:val="clear" w:color="auto" w:fill="F2F3F4"/>
+            <w:tcMar>
+              <w:top w:w="80" w:type="dxa"/>
+              <w:left w:w="120" w:type="dxa"/>
+              <w:bottom w:w="80" w:type="dxa"/>
+              <w:right w:w="120" w:type="dxa"/>
+            </w:tcMar>
+          </w:tcPr>
+          <w:p>
+            <w:pPr>
+              <w:rPr>
+                <w:color w:val="2C3E50"/>
+                <w:sz w:val="20"/>
+                <w:szCs w:val="20"/>
+              </w:rPr>
+            </w:pPr>
+            <w:r>
+              <w:rPr>
+                <w:color w:val="2C3E50"/>
+                <w:sz w:val="20"/>
+                <w:szCs w:val="20"/>
+              </w:rPr>
+              <w:t>~425 orders</w:t>
             </w:r>
           </w:p>
         </w:tc>
@@ -2403,6 +2698,7 @@
                 <w:sz w:val="20"/>
                 <w:szCs w:val="20"/>
               </w:rPr>
+              <w:lastRenderedPageBreak/>
               <w:t>Order Date</w:t>
             </w:r>
           </w:p>
@@ -2517,7 +2813,7 @@
                 <w:sz w:val="20"/>
                 <w:szCs w:val="20"/>
               </w:rPr>
-              <w:t>Date the order was shipped from factory</w:t>
+              <w:t>Planned future delivery date (2026–2030</w:t>
             </w:r>
           </w:p>
         </w:tc>
@@ -3291,7 +3587,7 @@
                 <w:sz w:val="20"/>
                 <w:szCs w:val="20"/>
               </w:rPr>
-              <w:t>Ship Date minus Order Date in days</w:t>
+              <w:t>Planned Ship Date minus Order Date in days</w:t>
             </w:r>
           </w:p>
         </w:tc>
@@ -3371,13 +3667,36 @@
             </w:tcMar>
           </w:tcPr>
           <w:p>
-            <w:r>
-              <w:rPr>
-                <w:color w:val="2C3E50"/>
+            <w:pPr>
+              <w:rPr>
+                <w:color w:val="595959" w:themeColor="text1" w:themeTint="A6"/>
+                <w:sz w:val="20"/>
+                <w:szCs w:val="20"/>
+              </w:rPr>
+            </w:pPr>
+            <w:r>
+              <w:rPr>
+                <w:color w:val="595959" w:themeColor="text1" w:themeTint="A6"/>
                 <w:sz w:val="20"/>
                 <w:szCs w:val="20"/>
               </w:rPr>
               <w:t>Mapped from product-factory correlation</w:t>
+            </w:r>
+          </w:p>
+          <w:p>
+            <w:r>
+              <w:rPr>
+                <w:color w:val="595959" w:themeColor="text1" w:themeTint="A6"/>
+              </w:rPr>
+              <w:t>(</w:t>
+            </w:r>
+            <w:r>
+              <w:rPr>
+                <w:color w:val="595959" w:themeColor="text1" w:themeTint="A6"/>
+                <w:sz w:val="20"/>
+                <w:szCs w:val="20"/>
+              </w:rPr>
+              <w:t>Project Description)</w:t>
             </w:r>
           </w:p>
         </w:tc>
@@ -3512,7 +3831,6 @@
           <w:iCs/>
           <w:color w:val="666666"/>
         </w:rPr>
-        <w:lastRenderedPageBreak/>
         <w:t>* Engineered features were created during the analysis and did not exist in the original dataset.</w:t>
       </w:r>
     </w:p>
@@ -3674,6 +3992,7 @@
         <w:pStyle w:val="Heading2"/>
       </w:pPr>
       <w:r>
+        <w:lastRenderedPageBreak/>
         <w:t>5.3 Invalid Lead Times</w:t>
       </w:r>
     </w:p>
@@ -3832,7 +4151,6 @@
         <w:rPr>
           <w:color w:val="2C3E50"/>
         </w:rPr>
-        <w:lastRenderedPageBreak/>
         <w:t>The original dataset did not contain all the columns we needed. We created three new columns — Lead Time, Factory, and Route — each building on the previous. These three engineered features drive every single analysis in this report.</w:t>
       </w:r>
     </w:p>
@@ -3851,19 +4169,17 @@
     </w:p>
     <w:p>
       <w:pPr>
-        <w:spacing w:before="80" w:after="80"/>
-      </w:pPr>
-      <w:r>
-        <w:rPr>
-          <w:color w:val="2C3E50"/>
-        </w:rPr>
-        <w:t>Lead Time is the most important column in this entire project. Every KPI, every chart, and every finding flows from this one calculation.</w:t>
-      </w:r>
-    </w:p>
-    <w:p>
-      <w:pPr>
         <w:spacing w:before="100" w:after="100"/>
-      </w:pPr>
+        <w:rPr>
+          <w:color w:val="262626" w:themeColor="text1" w:themeTint="D9"/>
+        </w:rPr>
+      </w:pPr>
+      <w:r>
+        <w:rPr>
+          <w:color w:val="262626" w:themeColor="text1" w:themeTint="D9"/>
+        </w:rPr>
+        <w:t>Lead Time is the single most important column in this entire project. It measures the planned number of days between when a customer places an order and when it is scheduled to be delivered.</w:t>
+      </w:r>
     </w:p>
     <w:p>
       <w:pPr>
@@ -3879,7 +4195,27 @@
           <w:sz w:val="26"/>
           <w:szCs w:val="26"/>
         </w:rPr>
-        <w:t>Lead Time (days)  =  Ship Date  minus  Order Date</w:t>
+        <w:t xml:space="preserve">Lead Time (days)  =  </w:t>
+      </w:r>
+      <w:r>
+        <w:rPr>
+          <w:b/>
+          <w:bCs/>
+          <w:color w:val="2E75B6"/>
+          <w:sz w:val="26"/>
+          <w:szCs w:val="26"/>
+        </w:rPr>
+        <w:t xml:space="preserve">Planned </w:t>
+      </w:r>
+      <w:r>
+        <w:rPr>
+          <w:b/>
+          <w:bCs/>
+          <w:color w:val="2E75B6"/>
+          <w:sz w:val="26"/>
+          <w:szCs w:val="26"/>
+        </w:rPr>
+        <w:t>Ship Date  minus  Order Date</w:t>
       </w:r>
     </w:p>
     <w:p>
@@ -4028,6 +4364,7 @@
                 <w:sz w:val="20"/>
                 <w:szCs w:val="20"/>
               </w:rPr>
+              <w:lastRenderedPageBreak/>
               <w:t>Factory</w:t>
             </w:r>
           </w:p>
@@ -4612,7 +4949,6 @@
           <w:bCs/>
           <w:color w:val="2C3E50"/>
         </w:rPr>
-        <w:lastRenderedPageBreak/>
         <w:t xml:space="preserve">Most Common Route: </w:t>
       </w:r>
       <w:r>
@@ -4620,6 +4956,12 @@
           <w:color w:val="2C3E50"/>
         </w:rPr>
         <w:t>Lot's O' Nuts to California</w:t>
+      </w:r>
+      <w:r>
+        <w:rPr>
+          <w:color w:val="2C3E50"/>
+        </w:rPr>
+        <w:t>(highest order volume)</w:t>
       </w:r>
     </w:p>
     <w:p>
@@ -4635,7 +4977,13 @@
         </w:pBdr>
       </w:pPr>
       <w:r>
-        <w:t>7. Shipping Lead Time Analysis</w:t>
+        <w:t xml:space="preserve">7. </w:t>
+      </w:r>
+      <w:r>
+        <w:t>Planned</w:t>
+      </w:r>
+      <w:r>
+        <w:t xml:space="preserve"> Lead Time Analysis</w:t>
       </w:r>
     </w:p>
     <w:tbl>
@@ -4789,7 +5137,23 @@
                 <w:sz w:val="20"/>
                 <w:szCs w:val="20"/>
               </w:rPr>
-              <w:t>Minimum Lead Time</w:t>
+              <w:t xml:space="preserve">Minimum </w:t>
+            </w:r>
+            <w:r>
+              <w:rPr>
+                <w:color w:val="2C3E50"/>
+                <w:sz w:val="20"/>
+                <w:szCs w:val="20"/>
+              </w:rPr>
+              <w:t xml:space="preserve"> Planned </w:t>
+            </w:r>
+            <w:r>
+              <w:rPr>
+                <w:color w:val="2C3E50"/>
+                <w:sz w:val="20"/>
+                <w:szCs w:val="20"/>
+              </w:rPr>
+              <w:t>Lead Time</w:t>
             </w:r>
           </w:p>
         </w:tc>
@@ -4875,7 +5239,23 @@
                 <w:sz w:val="20"/>
                 <w:szCs w:val="20"/>
               </w:rPr>
-              <w:t>Maximum Lead Time</w:t>
+              <w:t xml:space="preserve">Maximum </w:t>
+            </w:r>
+            <w:r>
+              <w:rPr>
+                <w:color w:val="2C3E50"/>
+                <w:sz w:val="20"/>
+                <w:szCs w:val="20"/>
+              </w:rPr>
+              <w:t xml:space="preserve">Planned </w:t>
+            </w:r>
+            <w:r>
+              <w:rPr>
+                <w:color w:val="2C3E50"/>
+                <w:sz w:val="20"/>
+                <w:szCs w:val="20"/>
+              </w:rPr>
+              <w:t>Lead Time</w:t>
             </w:r>
           </w:p>
         </w:tc>
@@ -4961,7 +5341,23 @@
                 <w:sz w:val="20"/>
                 <w:szCs w:val="20"/>
               </w:rPr>
-              <w:t>Average Lead Time</w:t>
+              <w:t xml:space="preserve">Average </w:t>
+            </w:r>
+            <w:r>
+              <w:rPr>
+                <w:color w:val="2C3E50"/>
+                <w:sz w:val="20"/>
+                <w:szCs w:val="20"/>
+              </w:rPr>
+              <w:t xml:space="preserve"> Planned </w:t>
+            </w:r>
+            <w:r>
+              <w:rPr>
+                <w:color w:val="2C3E50"/>
+                <w:sz w:val="20"/>
+                <w:szCs w:val="20"/>
+              </w:rPr>
+              <w:t>Lead Time</w:t>
             </w:r>
           </w:p>
         </w:tc>
@@ -5047,7 +5443,23 @@
                 <w:sz w:val="20"/>
                 <w:szCs w:val="20"/>
               </w:rPr>
-              <w:t>Median Lead Time</w:t>
+              <w:t xml:space="preserve">Median </w:t>
+            </w:r>
+            <w:r>
+              <w:rPr>
+                <w:color w:val="2C3E50"/>
+                <w:sz w:val="20"/>
+                <w:szCs w:val="20"/>
+              </w:rPr>
+              <w:t xml:space="preserve">Planned </w:t>
+            </w:r>
+            <w:r>
+              <w:rPr>
+                <w:color w:val="2C3E50"/>
+                <w:sz w:val="20"/>
+                <w:szCs w:val="20"/>
+              </w:rPr>
+              <w:t>Lead Time</w:t>
             </w:r>
           </w:p>
         </w:tc>
@@ -5233,6 +5645,7 @@
         <w:pStyle w:val="Heading2"/>
       </w:pPr>
       <w:r>
+        <w:lastRenderedPageBreak/>
         <w:t>7.1 Lead Time Distribution</w:t>
       </w:r>
     </w:p>
@@ -5250,7 +5663,6 @@
         <w:rPr>
           <w:noProof/>
         </w:rPr>
-        <w:lastRenderedPageBreak/>
         <w:drawing>
           <wp:inline distT="0" distB="0" distL="0" distR="0" wp14:anchorId="02092C38" wp14:editId="689DB25A">
             <wp:extent cx="5943600" cy="4245610"/>
@@ -5373,26 +5785,23 @@
           <w:bCs/>
           <w:color w:val="2C3E50"/>
         </w:rPr>
-        <w:t xml:space="preserve">Orders Below Average Lead Time: </w:t>
-      </w:r>
-      <w:r>
-        <w:rPr>
-          <w:color w:val="2C3E50"/>
-        </w:rPr>
-        <w:t>50%</w:t>
-      </w:r>
-    </w:p>
-    <w:p>
-      <w:pPr>
-        <w:spacing w:before="80" w:after="80"/>
-      </w:pPr>
+        <w:t xml:space="preserve">Orders Below Average </w:t>
+      </w:r>
       <w:r>
         <w:rPr>
           <w:b/>
           <w:bCs/>
           <w:color w:val="2C3E50"/>
         </w:rPr>
-        <w:t xml:space="preserve">Orders Above Average Lead Time: </w:t>
+        <w:t xml:space="preserve">Planned </w:t>
+      </w:r>
+      <w:r>
+        <w:rPr>
+          <w:b/>
+          <w:bCs/>
+          <w:color w:val="2C3E50"/>
+        </w:rPr>
+        <w:t xml:space="preserve">Lead Time: </w:t>
       </w:r>
       <w:r>
         <w:rPr>
@@ -5400,6 +5809,71 @@
         </w:rPr>
         <w:t>50%</w:t>
       </w:r>
+    </w:p>
+    <w:p>
+      <w:pPr>
+        <w:spacing w:before="80" w:after="80"/>
+        <w:rPr>
+          <w:color w:val="2C3E50"/>
+        </w:rPr>
+      </w:pPr>
+      <w:r>
+        <w:rPr>
+          <w:b/>
+          <w:bCs/>
+          <w:color w:val="2C3E50"/>
+        </w:rPr>
+        <w:t>Orders Above Average</w:t>
+      </w:r>
+      <w:r>
+        <w:rPr>
+          <w:b/>
+          <w:bCs/>
+          <w:color w:val="2C3E50"/>
+        </w:rPr>
+        <w:t xml:space="preserve"> Planned </w:t>
+      </w:r>
+      <w:r>
+        <w:rPr>
+          <w:b/>
+          <w:bCs/>
+          <w:color w:val="2C3E50"/>
+        </w:rPr>
+        <w:t xml:space="preserve"> Lead Time: </w:t>
+      </w:r>
+      <w:r>
+        <w:rPr>
+          <w:color w:val="2C3E50"/>
+        </w:rPr>
+        <w:t>50%</w:t>
+      </w:r>
+    </w:p>
+    <w:p>
+      <w:pPr>
+        <w:spacing w:before="80" w:after="80"/>
+        <w:rPr>
+          <w:color w:val="2C3E50"/>
+        </w:rPr>
+      </w:pPr>
+    </w:p>
+    <w:p>
+      <w:pPr>
+        <w:spacing w:before="80" w:after="80"/>
+        <w:rPr>
+          <w:color w:val="767171" w:themeColor="background2" w:themeShade="80"/>
+        </w:rPr>
+      </w:pPr>
+      <w:r>
+        <w:rPr>
+          <w:color w:val="767171" w:themeColor="background2" w:themeShade="80"/>
+        </w:rPr>
+        <w:t>Since we use the average as our delay threshold, this 50/50 split is expected. What matters is not the overall split but which specific routes and factories fall on each side.</w:t>
+      </w:r>
+    </w:p>
+    <w:p>
+      <w:pPr>
+        <w:spacing w:before="80" w:after="80"/>
+      </w:pPr>
     </w:p>
     <w:p>
       <w:pPr>
@@ -5425,6 +5899,7 @@
         <w:rPr>
           <w:color w:val="2C3E50"/>
         </w:rPr>
+        <w:lastRenderedPageBreak/>
         <w:t>After running the full analysis across 196 routes, 59 states and provinces, 4 regions, 5 factories, and 4 ship modes, here are the most important things we found:</w:t>
       </w:r>
     </w:p>
@@ -5432,6 +5907,15 @@
       <w:pPr>
         <w:spacing w:before="100" w:after="100"/>
       </w:pPr>
+      <w:r>
+        <w:t xml:space="preserve">   </w:t>
+      </w:r>
+      <w:r>
+        <w:rPr>
+          <w:highlight w:val="darkGray"/>
+        </w:rPr>
+        <w:t>Note:Delay Drequency is Above-Average Delay Rate</w:t>
+      </w:r>
     </w:p>
     <w:p>
       <w:pPr>
@@ -5490,13 +5974,21 @@
           <w:bCs/>
           <w:color w:val="2C3E50"/>
         </w:rPr>
+        <w:t xml:space="preserve">Planned </w:t>
+      </w:r>
+      <w:r>
+        <w:rPr>
+          <w:b/>
+          <w:bCs/>
+          <w:color w:val="2C3E50"/>
+        </w:rPr>
         <w:t xml:space="preserve">Average Lead Time: </w:t>
       </w:r>
       <w:r>
         <w:rPr>
           <w:color w:val="2C3E50"/>
         </w:rPr>
-        <w:t>906.0 days</w:t>
+        <w:t>906.days</w:t>
       </w:r>
     </w:p>
     <w:p>
@@ -5530,7 +6022,6 @@
           <w:bCs/>
           <w:color w:val="2C3E50"/>
         </w:rPr>
-        <w:lastRenderedPageBreak/>
         <w:t xml:space="preserve">Efficiency Score: </w:t>
       </w:r>
       <w:r>
@@ -5602,6 +6093,14 @@
           <w:bCs/>
           <w:color w:val="2C3E50"/>
         </w:rPr>
+        <w:t xml:space="preserve">Planned </w:t>
+      </w:r>
+      <w:r>
+        <w:rPr>
+          <w:b/>
+          <w:bCs/>
+          <w:color w:val="2C3E50"/>
+        </w:rPr>
         <w:t xml:space="preserve">Average Lead Time: </w:t>
       </w:r>
       <w:r>
@@ -5693,7 +6192,23 @@
           <w:bCs/>
           <w:color w:val="2C3E50"/>
         </w:rPr>
-        <w:t xml:space="preserve">Most Delayed State: </w:t>
+        <w:t>Most Delayed State</w:t>
+      </w:r>
+      <w:r>
+        <w:rPr>
+          <w:b/>
+          <w:bCs/>
+          <w:color w:val="2C3E50"/>
+        </w:rPr>
+        <w:t>(Planned)</w:t>
+      </w:r>
+      <w:r>
+        <w:rPr>
+          <w:b/>
+          <w:bCs/>
+          <w:color w:val="2C3E50"/>
+        </w:rPr>
+        <w:t xml:space="preserve">: </w:t>
       </w:r>
       <w:r>
         <w:rPr>
@@ -5713,7 +6228,23 @@
           <w:bCs/>
           <w:color w:val="2C3E50"/>
         </w:rPr>
-        <w:t xml:space="preserve">Most Delayed Region: </w:t>
+        <w:t>Most Delayed Region</w:t>
+      </w:r>
+      <w:r>
+        <w:rPr>
+          <w:b/>
+          <w:bCs/>
+          <w:color w:val="2C3E50"/>
+        </w:rPr>
+        <w:t>(Planned)</w:t>
+      </w:r>
+      <w:r>
+        <w:rPr>
+          <w:b/>
+          <w:bCs/>
+          <w:color w:val="2C3E50"/>
+        </w:rPr>
+        <w:t xml:space="preserve">: </w:t>
       </w:r>
       <w:r>
         <w:rPr>
@@ -5985,6 +6516,7 @@
         <w:rPr>
           <w:color w:val="2C3E50"/>
         </w:rPr>
+        <w:lastRenderedPageBreak/>
         <w:t>One of the requirements of this analysis was to evaluate cost-time tradeoffs across shipping methods. In other words — are customers getting what they pay for? Is a more expensive ship mode actually faster?</w:t>
       </w:r>
     </w:p>
@@ -6496,7 +7028,6 @@
                 <w:sz w:val="20"/>
                 <w:szCs w:val="20"/>
               </w:rPr>
-              <w:lastRenderedPageBreak/>
               <w:t>Same Day</w:t>
             </w:r>
           </w:p>
@@ -6935,7 +7466,6 @@
         <w:rPr>
           <w:color w:val="2C3E50"/>
         </w:rPr>
-        <w:lastRenderedPageBreak/>
         <w:t>Conduct an operational audit of Sugar Shack factory. As the worst performing factory overall, Sugar Shack's internal processes may be causing delays that affect all routes originating from this location. Fixing the root cause here could improve performance across multiple routes simultaneously.</w:t>
       </w:r>
     </w:p>
@@ -7028,7 +7558,19 @@
         <w:rPr>
           <w:color w:val="2C3E50"/>
         </w:rPr>
-        <w:t>Ship Dates in this dataset represent planned future delivery dates, not completed historical deliveries. Lead times therefore reflect planned timelines rather than actual shipping performance.</w:t>
+        <w:t>Ship Dates in this dataset represent planned future delivery dates</w:t>
+      </w:r>
+      <w:r>
+        <w:rPr>
+          <w:color w:val="2C3E50"/>
+        </w:rPr>
+        <w:t>(2026-2030)</w:t>
+      </w:r>
+      <w:r>
+        <w:rPr>
+          <w:color w:val="2C3E50"/>
+        </w:rPr>
+        <w:t>, not completed historical deliveries. Lead times therefore reflect planned timelines rather than actual shipping performance.</w:t>
       </w:r>
     </w:p>
     <w:p>
@@ -7081,6 +7623,29 @@
     </w:p>
     <w:p>
       <w:pPr>
+        <w:pStyle w:val="ListParagraph"/>
+        <w:numPr>
+          <w:ilvl w:val="0"/>
+          <w:numId w:val="2"/>
+        </w:numPr>
+        <w:spacing w:before="60" w:after="60"/>
+      </w:pPr>
+      <w:r>
+        <w:rPr>
+          <w:color w:val="2C3E50"/>
+        </w:rPr>
+        <w:t>Average orders per month (~425) is calculated as total orders (10,194) divided by the number of months in the order period (24 months).</w:t>
+      </w:r>
+    </w:p>
+    <w:p>
+      <w:pPr>
+        <w:pStyle w:val="ListParagraph"/>
+        <w:spacing w:before="60" w:after="60"/>
+        <w:ind w:left="720"/>
+      </w:pPr>
+    </w:p>
+    <w:p>
+      <w:pPr>
         <w:spacing w:before="100" w:after="100"/>
       </w:pPr>
     </w:p>
@@ -7103,7 +7668,20 @@
         <w:rPr>
           <w:color w:val="2C3E50"/>
         </w:rPr>
-        <w:t>This analysis set out to answer a straightforward question — how well is Nassau Candy Distributor's shipping network actually performing? After examining over 10,000 orders across 196 routes, 59 states and provinces, 5 factories, and 4 ship modes, we now have a clear and data-driven answer.</w:t>
+        <w:lastRenderedPageBreak/>
+        <w:t>This analysis set out to answer a straightforward question — how well is Nassau Candy Distributor's shipping network actually performing? After examining  10,</w:t>
+      </w:r>
+      <w:r>
+        <w:rPr>
+          <w:color w:val="2C3E50"/>
+        </w:rPr>
+        <w:t>194</w:t>
+      </w:r>
+      <w:r>
+        <w:rPr>
+          <w:color w:val="2C3E50"/>
+        </w:rPr>
+        <w:t xml:space="preserve"> orders across 196 routes, 59 states and provinces, 5 factories, and 4 ship modes, we now have a clear and data-driven answer.</w:t>
       </w:r>
     </w:p>
     <w:p>
@@ -7499,6 +8077,197 @@
     </w:lvl>
   </w:abstractNum>
   <w:abstractNum w:abstractNumId="1" w15:restartNumberingAfterBreak="0">
+    <w:nsid w:val="17B47973"/>
+    <w:multiLevelType w:val="hybridMultilevel"/>
+    <w:tmpl w:val="13EC8998"/>
+    <w:lvl w:ilvl="0" w:tplc="16AE5F18">
+      <w:start w:val="1"/>
+      <w:numFmt w:val="bullet"/>
+      <w:lvlText w:val="•"/>
+      <w:lvlJc w:val="left"/>
+      <w:pPr>
+        <w:ind w:left="720" w:hanging="360"/>
+      </w:pPr>
+    </w:lvl>
+    <w:lvl w:ilvl="1" w:tplc="70EC7C1A">
+      <w:numFmt w:val="decimal"/>
+      <w:lvlText w:val=""/>
+      <w:lvlJc w:val="left"/>
+      <w:pPr>
+        <w:ind w:left="0" w:firstLine="0"/>
+      </w:pPr>
+    </w:lvl>
+    <w:lvl w:ilvl="2" w:tplc="50925300">
+      <w:numFmt w:val="decimal"/>
+      <w:lvlText w:val=""/>
+      <w:lvlJc w:val="left"/>
+      <w:pPr>
+        <w:ind w:left="0" w:firstLine="0"/>
+      </w:pPr>
+    </w:lvl>
+    <w:lvl w:ilvl="3" w:tplc="874618C8">
+      <w:numFmt w:val="decimal"/>
+      <w:lvlText w:val=""/>
+      <w:lvlJc w:val="left"/>
+      <w:pPr>
+        <w:ind w:left="0" w:firstLine="0"/>
+      </w:pPr>
+    </w:lvl>
+    <w:lvl w:ilvl="4" w:tplc="0FCA3A94">
+      <w:numFmt w:val="decimal"/>
+      <w:lvlText w:val=""/>
+      <w:lvlJc w:val="left"/>
+      <w:pPr>
+        <w:ind w:left="0" w:firstLine="0"/>
+      </w:pPr>
+    </w:lvl>
+    <w:lvl w:ilvl="5" w:tplc="A3CA0996">
+      <w:numFmt w:val="decimal"/>
+      <w:lvlText w:val=""/>
+      <w:lvlJc w:val="left"/>
+      <w:pPr>
+        <w:ind w:left="0" w:firstLine="0"/>
+      </w:pPr>
+    </w:lvl>
+    <w:lvl w:ilvl="6" w:tplc="25C44BEA">
+      <w:numFmt w:val="decimal"/>
+      <w:lvlText w:val=""/>
+      <w:lvlJc w:val="left"/>
+      <w:pPr>
+        <w:ind w:left="0" w:firstLine="0"/>
+      </w:pPr>
+    </w:lvl>
+    <w:lvl w:ilvl="7" w:tplc="BAA4AD36">
+      <w:numFmt w:val="decimal"/>
+      <w:lvlText w:val=""/>
+      <w:lvlJc w:val="left"/>
+      <w:pPr>
+        <w:ind w:left="0" w:firstLine="0"/>
+      </w:pPr>
+    </w:lvl>
+    <w:lvl w:ilvl="8" w:tplc="7820FD06">
+      <w:numFmt w:val="decimal"/>
+      <w:lvlText w:val=""/>
+      <w:lvlJc w:val="left"/>
+      <w:pPr>
+        <w:ind w:left="0" w:firstLine="0"/>
+      </w:pPr>
+    </w:lvl>
+  </w:abstractNum>
+  <w:abstractNum w:abstractNumId="2" w15:restartNumberingAfterBreak="0">
+    <w:nsid w:val="3D0F35BF"/>
+    <w:multiLevelType w:val="hybridMultilevel"/>
+    <w:tmpl w:val="4250585C"/>
+    <w:lvl w:ilvl="0" w:tplc="40090001">
+      <w:start w:val="1"/>
+      <w:numFmt w:val="bullet"/>
+      <w:lvlText w:val=""/>
+      <w:lvlJc w:val="left"/>
+      <w:pPr>
+        <w:ind w:left="720" w:hanging="360"/>
+      </w:pPr>
+      <w:rPr>
+        <w:rFonts w:ascii="Symbol" w:hAnsi="Symbol" w:hint="default"/>
+      </w:rPr>
+    </w:lvl>
+    <w:lvl w:ilvl="1" w:tplc="40090003" w:tentative="1">
+      <w:start w:val="1"/>
+      <w:numFmt w:val="bullet"/>
+      <w:lvlText w:val="o"/>
+      <w:lvlJc w:val="left"/>
+      <w:pPr>
+        <w:ind w:left="1440" w:hanging="360"/>
+      </w:pPr>
+      <w:rPr>
+        <w:rFonts w:ascii="Courier New" w:hAnsi="Courier New" w:cs="Courier New" w:hint="default"/>
+      </w:rPr>
+    </w:lvl>
+    <w:lvl w:ilvl="2" w:tplc="40090005" w:tentative="1">
+      <w:start w:val="1"/>
+      <w:numFmt w:val="bullet"/>
+      <w:lvlText w:val=""/>
+      <w:lvlJc w:val="left"/>
+      <w:pPr>
+        <w:ind w:left="2160" w:hanging="360"/>
+      </w:pPr>
+      <w:rPr>
+        <w:rFonts w:ascii="Wingdings" w:hAnsi="Wingdings" w:hint="default"/>
+      </w:rPr>
+    </w:lvl>
+    <w:lvl w:ilvl="3" w:tplc="40090001" w:tentative="1">
+      <w:start w:val="1"/>
+      <w:numFmt w:val="bullet"/>
+      <w:lvlText w:val=""/>
+      <w:lvlJc w:val="left"/>
+      <w:pPr>
+        <w:ind w:left="2880" w:hanging="360"/>
+      </w:pPr>
+      <w:rPr>
+        <w:rFonts w:ascii="Symbol" w:hAnsi="Symbol" w:hint="default"/>
+      </w:rPr>
+    </w:lvl>
+    <w:lvl w:ilvl="4" w:tplc="40090003" w:tentative="1">
+      <w:start w:val="1"/>
+      <w:numFmt w:val="bullet"/>
+      <w:lvlText w:val="o"/>
+      <w:lvlJc w:val="left"/>
+      <w:pPr>
+        <w:ind w:left="3600" w:hanging="360"/>
+      </w:pPr>
+      <w:rPr>
+        <w:rFonts w:ascii="Courier New" w:hAnsi="Courier New" w:cs="Courier New" w:hint="default"/>
+      </w:rPr>
+    </w:lvl>
+    <w:lvl w:ilvl="5" w:tplc="40090005" w:tentative="1">
+      <w:start w:val="1"/>
+      <w:numFmt w:val="bullet"/>
+      <w:lvlText w:val=""/>
+      <w:lvlJc w:val="left"/>
+      <w:pPr>
+        <w:ind w:left="4320" w:hanging="360"/>
+      </w:pPr>
+      <w:rPr>
+        <w:rFonts w:ascii="Wingdings" w:hAnsi="Wingdings" w:hint="default"/>
+      </w:rPr>
+    </w:lvl>
+    <w:lvl w:ilvl="6" w:tplc="40090001" w:tentative="1">
+      <w:start w:val="1"/>
+      <w:numFmt w:val="bullet"/>
+      <w:lvlText w:val=""/>
+      <w:lvlJc w:val="left"/>
+      <w:pPr>
+        <w:ind w:left="5040" w:hanging="360"/>
+      </w:pPr>
+      <w:rPr>
+        <w:rFonts w:ascii="Symbol" w:hAnsi="Symbol" w:hint="default"/>
+      </w:rPr>
+    </w:lvl>
+    <w:lvl w:ilvl="7" w:tplc="40090003" w:tentative="1">
+      <w:start w:val="1"/>
+      <w:numFmt w:val="bullet"/>
+      <w:lvlText w:val="o"/>
+      <w:lvlJc w:val="left"/>
+      <w:pPr>
+        <w:ind w:left="5760" w:hanging="360"/>
+      </w:pPr>
+      <w:rPr>
+        <w:rFonts w:ascii="Courier New" w:hAnsi="Courier New" w:cs="Courier New" w:hint="default"/>
+      </w:rPr>
+    </w:lvl>
+    <w:lvl w:ilvl="8" w:tplc="40090005" w:tentative="1">
+      <w:start w:val="1"/>
+      <w:numFmt w:val="bullet"/>
+      <w:lvlText w:val=""/>
+      <w:lvlJc w:val="left"/>
+      <w:pPr>
+        <w:ind w:left="6480" w:hanging="360"/>
+      </w:pPr>
+      <w:rPr>
+        <w:rFonts w:ascii="Wingdings" w:hAnsi="Wingdings" w:hint="default"/>
+      </w:rPr>
+    </w:lvl>
+  </w:abstractNum>
+  <w:abstractNum w:abstractNumId="3" w15:restartNumberingAfterBreak="0">
     <w:nsid w:val="4EBE0747"/>
     <w:multiLevelType w:val="hybridMultilevel"/>
     <w:tmpl w:val="BA06017A"/>
@@ -7552,7 +8321,7 @@
       <w:lvlJc w:val="left"/>
     </w:lvl>
   </w:abstractNum>
-  <w:abstractNum w:abstractNumId="2" w15:restartNumberingAfterBreak="0">
+  <w:abstractNum w:abstractNumId="4" w15:restartNumberingAfterBreak="0">
     <w:nsid w:val="7ED032F1"/>
     <w:multiLevelType w:val="hybridMultilevel"/>
     <w:tmpl w:val="902A0F3E"/>
@@ -7639,13 +8408,13 @@
     </w:lvl>
   </w:abstractNum>
   <w:num w:numId="1" w16cid:durableId="1126699423">
-    <w:abstractNumId w:val="2"/>
+    <w:abstractNumId w:val="4"/>
     <w:lvlOverride w:ilvl="0">
       <w:startOverride w:val="1"/>
     </w:lvlOverride>
   </w:num>
   <w:num w:numId="2" w16cid:durableId="82148970">
-    <w:abstractNumId w:val="1"/>
+    <w:abstractNumId w:val="3"/>
     <w:lvlOverride w:ilvl="0">
       <w:startOverride w:val="1"/>
     </w:lvlOverride>
@@ -7655,6 +8424,21 @@
     <w:lvlOverride w:ilvl="0">
       <w:startOverride w:val="1"/>
     </w:lvlOverride>
+  </w:num>
+  <w:num w:numId="4" w16cid:durableId="1487866211">
+    <w:abstractNumId w:val="1"/>
+    <w:lvlOverride w:ilvl="0"/>
+    <w:lvlOverride w:ilvl="1"/>
+    <w:lvlOverride w:ilvl="2"/>
+    <w:lvlOverride w:ilvl="3"/>
+    <w:lvlOverride w:ilvl="4"/>
+    <w:lvlOverride w:ilvl="5"/>
+    <w:lvlOverride w:ilvl="6"/>
+    <w:lvlOverride w:ilvl="7"/>
+    <w:lvlOverride w:ilvl="8"/>
+  </w:num>
+  <w:num w:numId="5" w16cid:durableId="752362185">
+    <w:abstractNumId w:val="2"/>
   </w:num>
 </w:numbering>
 </file>
@@ -8146,7 +8930,6 @@
   <w:style w:type="character" w:default="1" w:styleId="DefaultParagraphFont">
     <w:name w:val="Default Paragraph Font"/>
     <w:uiPriority w:val="1"/>
-    <w:semiHidden/>
     <w:unhideWhenUsed/>
   </w:style>
   <w:style w:type="table" w:default="1" w:styleId="TableNormal">

</xml_diff>

<commit_message>
Final Touch To The Project
</commit_message>
<xml_diff>
--- a/report/Nassau_Candy_EDA_Report.docx
+++ b/report/Nassau_Candy_EDA_Report.docx
@@ -188,7 +188,45 @@
         <w:rPr>
           <w:color w:val="2C3E50"/>
         </w:rPr>
-        <w:t>This report presents a comprehensive exploratory data analysis of the Nassau Candy Distributor shipment dataset. Over 10,000 orders spanning two years were analyzed to understand how efficiently products move from 5 factories to customers across the United States and Canada.</w:t>
+        <w:t xml:space="preserve">This report presents a comprehensive exploratory data analysis of the Nassau Candy Distributor shipment dataset. </w:t>
+      </w:r>
+      <w:r>
+        <w:rPr>
+          <w:color w:val="2C3E50"/>
+        </w:rPr>
+        <w:t>Exact</w:t>
+      </w:r>
+      <w:r>
+        <w:rPr>
+          <w:color w:val="2C3E50"/>
+        </w:rPr>
+        <w:t xml:space="preserve"> 10,</w:t>
+      </w:r>
+      <w:r>
+        <w:rPr>
+          <w:color w:val="2C3E50"/>
+        </w:rPr>
+        <w:t>194</w:t>
+      </w:r>
+      <w:r>
+        <w:rPr>
+          <w:color w:val="2C3E50"/>
+        </w:rPr>
+        <w:t xml:space="preserve"> orders spanning two years were </w:t>
+      </w:r>
+      <w:proofErr w:type="spellStart"/>
+      <w:r>
+        <w:rPr>
+          <w:color w:val="2C3E50"/>
+        </w:rPr>
+        <w:t>analyzed</w:t>
+      </w:r>
+      <w:proofErr w:type="spellEnd"/>
+      <w:r>
+        <w:rPr>
+          <w:color w:val="2C3E50"/>
+        </w:rPr>
+        <w:t xml:space="preserve"> to understand how efficiently products move from 5 factories to customers across the United States and Canada.</w:t>
       </w:r>
     </w:p>
     <w:p>
@@ -349,8 +387,18 @@
                 <w:sz w:val="18"/>
                 <w:szCs w:val="18"/>
               </w:rPr>
-              <w:t>Routes Analyzed</w:t>
-            </w:r>
+              <w:t xml:space="preserve">Routes </w:t>
+            </w:r>
+            <w:proofErr w:type="spellStart"/>
+            <w:r>
+              <w:rPr>
+                <w:color w:val="666666"/>
+                <w:sz w:val="18"/>
+                <w:szCs w:val="18"/>
+              </w:rPr>
+              <w:t>Analyzed</w:t>
+            </w:r>
+            <w:proofErr w:type="spellEnd"/>
           </w:p>
         </w:tc>
         <w:tc>
@@ -389,13 +437,23 @@
             <w:pPr>
               <w:jc w:val="center"/>
             </w:pPr>
+            <w:proofErr w:type="spellStart"/>
             <w:r>
               <w:rPr>
                 <w:color w:val="666666"/>
                 <w:sz w:val="18"/>
                 <w:szCs w:val="18"/>
               </w:rPr>
-              <w:t>Avg Lead Time (Days)</w:t>
+              <w:t>Avg</w:t>
+            </w:r>
+            <w:proofErr w:type="spellEnd"/>
+            <w:r>
+              <w:rPr>
+                <w:color w:val="666666"/>
+                <w:sz w:val="18"/>
+                <w:szCs w:val="18"/>
+              </w:rPr>
+              <w:t xml:space="preserve"> Lead Time (Days)</w:t>
             </w:r>
           </w:p>
         </w:tc>
@@ -481,13 +539,23 @@
             <w:pPr>
               <w:jc w:val="center"/>
             </w:pPr>
+            <w:proofErr w:type="spellStart"/>
             <w:r>
               <w:rPr>
                 <w:color w:val="666666"/>
                 <w:sz w:val="18"/>
                 <w:szCs w:val="18"/>
               </w:rPr>
-              <w:t>Avg Efficiency Score</w:t>
+              <w:t>Avg</w:t>
+            </w:r>
+            <w:proofErr w:type="spellEnd"/>
+            <w:r>
+              <w:rPr>
+                <w:color w:val="666666"/>
+                <w:sz w:val="18"/>
+                <w:szCs w:val="18"/>
+              </w:rPr>
+              <w:t xml:space="preserve"> Efficiency Score</w:t>
             </w:r>
           </w:p>
         </w:tc>
@@ -758,15 +826,33 @@
                 <w:sz w:val="20"/>
                 <w:szCs w:val="20"/>
               </w:rPr>
-              <w:t>Most Delayed Region</w:t>
-            </w:r>
-            <w:r>
-              <w:rPr>
-                <w:color w:val="2C3E50"/>
-                <w:sz w:val="20"/>
-                <w:szCs w:val="20"/>
-              </w:rPr>
-              <w:t>(Planned)</w:t>
+              <w:t xml:space="preserve">Most Delayed </w:t>
+            </w:r>
+            <w:proofErr w:type="gramStart"/>
+            <w:r>
+              <w:rPr>
+                <w:color w:val="2C3E50"/>
+                <w:sz w:val="20"/>
+                <w:szCs w:val="20"/>
+              </w:rPr>
+              <w:t>Region</w:t>
+            </w:r>
+            <w:r>
+              <w:rPr>
+                <w:color w:val="2C3E50"/>
+                <w:sz w:val="20"/>
+                <w:szCs w:val="20"/>
+              </w:rPr>
+              <w:t>(</w:t>
+            </w:r>
+            <w:proofErr w:type="gramEnd"/>
+            <w:r>
+              <w:rPr>
+                <w:color w:val="2C3E50"/>
+                <w:sz w:val="20"/>
+                <w:szCs w:val="20"/>
+              </w:rPr>
+              <w:t>Planned)</w:t>
             </w:r>
           </w:p>
         </w:tc>
@@ -794,7 +880,25 @@
                 <w:sz w:val="20"/>
                 <w:szCs w:val="20"/>
               </w:rPr>
-              <w:t>Interior (Avg Lead Time: 1,323 days)</w:t>
+              <w:t>Interior (</w:t>
+            </w:r>
+            <w:proofErr w:type="spellStart"/>
+            <w:r>
+              <w:rPr>
+                <w:color w:val="2C3E50"/>
+                <w:sz w:val="20"/>
+                <w:szCs w:val="20"/>
+              </w:rPr>
+              <w:t>Avg</w:t>
+            </w:r>
+            <w:proofErr w:type="spellEnd"/>
+            <w:r>
+              <w:rPr>
+                <w:color w:val="2C3E50"/>
+                <w:sz w:val="20"/>
+                <w:szCs w:val="20"/>
+              </w:rPr>
+              <w:t xml:space="preserve"> Lead Time: 1,323 days)</w:t>
             </w:r>
           </w:p>
         </w:tc>
@@ -852,15 +956,33 @@
                 <w:sz w:val="20"/>
                 <w:szCs w:val="20"/>
               </w:rPr>
-              <w:t>The Other Factory</w:t>
-            </w:r>
-            <w:r>
-              <w:rPr>
-                <w:color w:val="2C3E50"/>
-                <w:sz w:val="20"/>
-                <w:szCs w:val="20"/>
-              </w:rPr>
-              <w:t>(Lowest Planned Lead Time)</w:t>
+              <w:t xml:space="preserve">The Other </w:t>
+            </w:r>
+            <w:proofErr w:type="gramStart"/>
+            <w:r>
+              <w:rPr>
+                <w:color w:val="2C3E50"/>
+                <w:sz w:val="20"/>
+                <w:szCs w:val="20"/>
+              </w:rPr>
+              <w:t>Factory</w:t>
+            </w:r>
+            <w:r>
+              <w:rPr>
+                <w:color w:val="2C3E50"/>
+                <w:sz w:val="20"/>
+                <w:szCs w:val="20"/>
+              </w:rPr>
+              <w:t>(</w:t>
+            </w:r>
+            <w:proofErr w:type="gramEnd"/>
+            <w:r>
+              <w:rPr>
+                <w:color w:val="2C3E50"/>
+                <w:sz w:val="20"/>
+                <w:szCs w:val="20"/>
+              </w:rPr>
+              <w:t>Lowest Planned Lead Time)</w:t>
             </w:r>
           </w:p>
         </w:tc>
@@ -918,15 +1040,33 @@
                 <w:sz w:val="20"/>
                 <w:szCs w:val="20"/>
               </w:rPr>
-              <w:t>Sugar Shack</w:t>
-            </w:r>
-            <w:r>
-              <w:rPr>
-                <w:color w:val="2C3E50"/>
-                <w:sz w:val="20"/>
-                <w:szCs w:val="20"/>
-              </w:rPr>
-              <w:t>(Highest Planned Lead Time)</w:t>
+              <w:t xml:space="preserve">Sugar </w:t>
+            </w:r>
+            <w:proofErr w:type="gramStart"/>
+            <w:r>
+              <w:rPr>
+                <w:color w:val="2C3E50"/>
+                <w:sz w:val="20"/>
+                <w:szCs w:val="20"/>
+              </w:rPr>
+              <w:t>Shack</w:t>
+            </w:r>
+            <w:r>
+              <w:rPr>
+                <w:color w:val="2C3E50"/>
+                <w:sz w:val="20"/>
+                <w:szCs w:val="20"/>
+              </w:rPr>
+              <w:t>(</w:t>
+            </w:r>
+            <w:proofErr w:type="gramEnd"/>
+            <w:r>
+              <w:rPr>
+                <w:color w:val="2C3E50"/>
+                <w:sz w:val="20"/>
+                <w:szCs w:val="20"/>
+              </w:rPr>
+              <w:t>Highest Planned Lead Time)</w:t>
             </w:r>
           </w:p>
         </w:tc>
@@ -1627,7 +1767,16 @@
               <w:spacing w:before="100" w:after="100"/>
             </w:pPr>
             <w:r>
-              <w:t>January 02, 2024</w:t>
+              <w:t>January 0</w:t>
+            </w:r>
+            <w:r>
+              <w:t>2</w:t>
+            </w:r>
+            <w:r>
+              <w:t>, 202</w:t>
+            </w:r>
+            <w:r>
+              <w:t>4</w:t>
             </w:r>
           </w:p>
         </w:tc>
@@ -1739,7 +1888,22 @@
               <w:spacing w:before="100" w:after="100"/>
             </w:pPr>
             <w:r>
-              <w:t>June 2026</w:t>
+              <w:t>J</w:t>
+            </w:r>
+            <w:r>
+              <w:t>une</w:t>
+            </w:r>
+            <w:r>
+              <w:t xml:space="preserve"> </w:t>
+            </w:r>
+            <w:r>
+              <w:t>6</w:t>
+            </w:r>
+            <w:r>
+              <w:t>,202</w:t>
+            </w:r>
+            <w:r>
+              <w:t>6</w:t>
             </w:r>
           </w:p>
         </w:tc>
@@ -1768,7 +1932,10 @@
               <w:spacing w:before="100" w:after="100"/>
             </w:pPr>
             <w:r>
-              <w:t>Latest Planned Ship Date</w:t>
+              <w:t>Future</w:t>
+            </w:r>
+            <w:r>
+              <w:t xml:space="preserve"> Planned Ship Date</w:t>
             </w:r>
           </w:p>
         </w:tc>
@@ -1795,7 +1962,19 @@
               <w:spacing w:before="100" w:after="100"/>
             </w:pPr>
             <w:r>
-              <w:t>June 2030</w:t>
+              <w:t>June</w:t>
+            </w:r>
+            <w:r>
+              <w:t xml:space="preserve"> </w:t>
+            </w:r>
+            <w:r>
+              <w:t>28</w:t>
+            </w:r>
+            <w:r>
+              <w:t>,20</w:t>
+            </w:r>
+            <w:r>
+              <w:t>30</w:t>
             </w:r>
           </w:p>
         </w:tc>
@@ -1851,7 +2030,16 @@
               <w:spacing w:before="100" w:after="100"/>
             </w:pPr>
             <w:r>
-              <w:t>729 days (approximately 2 years)</w:t>
+              <w:t>7</w:t>
+            </w:r>
+            <w:r>
+              <w:t>2</w:t>
+            </w:r>
+            <w:r>
+              <w:t>9</w:t>
+            </w:r>
+            <w:r>
+              <w:t xml:space="preserve"> days </w:t>
             </w:r>
           </w:p>
         </w:tc>
@@ -1879,6 +2067,145 @@
       <w:pPr>
         <w:spacing w:before="100" w:after="100"/>
       </w:pPr>
+    </w:p>
+    <w:p>
+      <w:pPr>
+        <w:spacing w:before="100" w:after="100"/>
+        <w:rPr>
+          <w:highlight w:val="cyan"/>
+        </w:rPr>
+      </w:pPr>
+      <w:r>
+        <w:rPr>
+          <w:highlight w:val="cyan"/>
+        </w:rPr>
+        <w:t xml:space="preserve">The gap between Order Dates (2024-2025) and Ship Dates (2026-2030) </w:t>
+      </w:r>
+    </w:p>
+    <w:p>
+      <w:pPr>
+        <w:spacing w:before="100" w:after="100"/>
+        <w:rPr>
+          <w:highlight w:val="cyan"/>
+        </w:rPr>
+      </w:pPr>
+      <w:r>
+        <w:rPr>
+          <w:highlight w:val="cyan"/>
+        </w:rPr>
+        <w:t>directly produces the lead times observed in this analysis:</w:t>
+      </w:r>
+    </w:p>
+    <w:p>
+      <w:pPr>
+        <w:spacing w:before="100" w:after="100"/>
+        <w:rPr>
+          <w:highlight w:val="cyan"/>
+        </w:rPr>
+      </w:pPr>
+    </w:p>
+    <w:p>
+      <w:pPr>
+        <w:spacing w:before="100" w:after="100"/>
+        <w:rPr>
+          <w:highlight w:val="cyan"/>
+        </w:rPr>
+      </w:pPr>
+      <w:r>
+        <w:rPr>
+          <w:highlight w:val="cyan"/>
+        </w:rPr>
+        <w:t xml:space="preserve">- Orders placed in January 2024 are planned to ship in mid-2026 </w:t>
+      </w:r>
+    </w:p>
+    <w:p>
+      <w:pPr>
+        <w:spacing w:before="100" w:after="100"/>
+        <w:rPr>
+          <w:highlight w:val="cyan"/>
+        </w:rPr>
+      </w:pPr>
+      <w:r>
+        <w:rPr>
+          <w:highlight w:val="cyan"/>
+        </w:rPr>
+        <w:t xml:space="preserve">  → approximately 904 days lead time</w:t>
+      </w:r>
+    </w:p>
+    <w:p>
+      <w:pPr>
+        <w:spacing w:before="100" w:after="100"/>
+        <w:rPr>
+          <w:highlight w:val="cyan"/>
+        </w:rPr>
+      </w:pPr>
+      <w:r>
+        <w:rPr>
+          <w:highlight w:val="cyan"/>
+        </w:rPr>
+        <w:t xml:space="preserve">- Orders placed in December 2025 are planned to ship in mid-2030 </w:t>
+      </w:r>
+    </w:p>
+    <w:p>
+      <w:pPr>
+        <w:spacing w:before="100" w:after="100"/>
+        <w:rPr>
+          <w:highlight w:val="cyan"/>
+        </w:rPr>
+      </w:pPr>
+      <w:r>
+        <w:rPr>
+          <w:highlight w:val="cyan"/>
+        </w:rPr>
+        <w:t xml:space="preserve">  → approximately 1,642 days lead time</w:t>
+      </w:r>
+    </w:p>
+    <w:p>
+      <w:pPr>
+        <w:spacing w:before="100" w:after="100"/>
+        <w:rPr>
+          <w:highlight w:val="cyan"/>
+        </w:rPr>
+      </w:pPr>
+    </w:p>
+    <w:p>
+      <w:pPr>
+        <w:spacing w:before="100" w:after="100"/>
+        <w:rPr>
+          <w:highlight w:val="cyan"/>
+        </w:rPr>
+      </w:pPr>
+      <w:r>
+        <w:rPr>
+          <w:highlight w:val="cyan"/>
+        </w:rPr>
+        <w:t xml:space="preserve">This is not a data error. It is the natural result of Nassau Candy's </w:t>
+      </w:r>
+    </w:p>
+    <w:p>
+      <w:pPr>
+        <w:spacing w:before="100" w:after="100"/>
+        <w:rPr>
+          <w:highlight w:val="cyan"/>
+        </w:rPr>
+      </w:pPr>
+      <w:r>
+        <w:rPr>
+          <w:highlight w:val="cyan"/>
+        </w:rPr>
+        <w:t xml:space="preserve">long-range delivery planning horizon. All lead times in this analysis </w:t>
+      </w:r>
+    </w:p>
+    <w:p>
+      <w:pPr>
+        <w:spacing w:before="100" w:after="100"/>
+      </w:pPr>
+      <w:r>
+        <w:rPr>
+          <w:highlight w:val="cyan"/>
+        </w:rPr>
+        <w:t>are mathematically consistent with the order and ship date ranges above.</w:t>
+      </w:r>
     </w:p>
     <w:p>
       <w:pPr>
@@ -2126,15 +2453,43 @@
                 <w:sz w:val="20"/>
                 <w:szCs w:val="20"/>
               </w:rPr>
-              <w:t>Unique States and Provinces</w:t>
-            </w:r>
-            <w:r>
-              <w:rPr>
-                <w:color w:val="2C3E50"/>
-                <w:sz w:val="20"/>
-                <w:szCs w:val="20"/>
-              </w:rPr>
-              <w:t>(US+Canada)</w:t>
+              <w:t xml:space="preserve">Unique States and </w:t>
+            </w:r>
+            <w:proofErr w:type="gramStart"/>
+            <w:r>
+              <w:rPr>
+                <w:color w:val="2C3E50"/>
+                <w:sz w:val="20"/>
+                <w:szCs w:val="20"/>
+              </w:rPr>
+              <w:t>Provinces</w:t>
+            </w:r>
+            <w:r>
+              <w:rPr>
+                <w:color w:val="2C3E50"/>
+                <w:sz w:val="20"/>
+                <w:szCs w:val="20"/>
+              </w:rPr>
+              <w:t>(</w:t>
+            </w:r>
+            <w:proofErr w:type="spellStart"/>
+            <w:proofErr w:type="gramEnd"/>
+            <w:r>
+              <w:rPr>
+                <w:color w:val="2C3E50"/>
+                <w:sz w:val="20"/>
+                <w:szCs w:val="20"/>
+              </w:rPr>
+              <w:t>US+Canada</w:t>
+            </w:r>
+            <w:proofErr w:type="spellEnd"/>
+            <w:r>
+              <w:rPr>
+                <w:color w:val="2C3E50"/>
+                <w:sz w:val="20"/>
+                <w:szCs w:val="20"/>
+              </w:rPr>
+              <w:t>)</w:t>
             </w:r>
           </w:p>
         </w:tc>
@@ -2311,6 +2666,7 @@
                 <w:sz w:val="20"/>
                 <w:szCs w:val="20"/>
               </w:rPr>
+              <w:lastRenderedPageBreak/>
               <w:t>Number of Factories</w:t>
             </w:r>
           </w:p>
@@ -2453,7 +2809,21 @@
         <w:rPr>
           <w:color w:val="2C3E50"/>
         </w:rPr>
-        <w:t>We only worked with columns directly relevant to shipping route efficiency. Sales, cost, and financial columns were used only for the ship mode cost-time tradeoff analysis in Section 8.6.</w:t>
+        <w:t xml:space="preserve">We only worked with columns directly relevant to shipping route efficiency. Sales, cost, and financial columns were used only for the ship mode cost-time </w:t>
+      </w:r>
+      <w:proofErr w:type="spellStart"/>
+      <w:r>
+        <w:rPr>
+          <w:color w:val="2C3E50"/>
+        </w:rPr>
+        <w:t>tradeoff</w:t>
+      </w:r>
+      <w:proofErr w:type="spellEnd"/>
+      <w:r>
+        <w:rPr>
+          <w:color w:val="2C3E50"/>
+        </w:rPr>
+        <w:t xml:space="preserve"> analysis in Section 8.6.</w:t>
       </w:r>
     </w:p>
     <w:p>
@@ -2698,7 +3068,6 @@
                 <w:sz w:val="20"/>
                 <w:szCs w:val="20"/>
               </w:rPr>
-              <w:lastRenderedPageBreak/>
               <w:t>Order Date</w:t>
             </w:r>
           </w:p>
@@ -2815,6 +3184,14 @@
               </w:rPr>
               <w:t>Planned future delivery date (2026–2030</w:t>
             </w:r>
+            <w:r>
+              <w:rPr>
+                <w:color w:val="2C3E50"/>
+                <w:sz w:val="20"/>
+                <w:szCs w:val="20"/>
+              </w:rPr>
+              <w:t>)</w:t>
+            </w:r>
           </w:p>
         </w:tc>
         <w:tc>
@@ -3415,7 +3792,25 @@
                 <w:sz w:val="20"/>
                 <w:szCs w:val="20"/>
               </w:rPr>
-              <w:t>Manufacturing cost — used in tradeoff analysis</w:t>
+              <w:t xml:space="preserve">Manufacturing cost — used in </w:t>
+            </w:r>
+            <w:proofErr w:type="spellStart"/>
+            <w:r>
+              <w:rPr>
+                <w:color w:val="2C3E50"/>
+                <w:sz w:val="20"/>
+                <w:szCs w:val="20"/>
+              </w:rPr>
+              <w:t>tradeoff</w:t>
+            </w:r>
+            <w:proofErr w:type="spellEnd"/>
+            <w:r>
+              <w:rPr>
+                <w:color w:val="2C3E50"/>
+                <w:sz w:val="20"/>
+                <w:szCs w:val="20"/>
+              </w:rPr>
+              <w:t xml:space="preserve"> analysis</w:t>
             </w:r>
           </w:p>
         </w:tc>
@@ -3501,7 +3896,25 @@
                 <w:sz w:val="20"/>
                 <w:szCs w:val="20"/>
               </w:rPr>
-              <w:t>Sales minus cost — used in tradeoff analysis</w:t>
+              <w:t xml:space="preserve">Sales minus cost — used in </w:t>
+            </w:r>
+            <w:proofErr w:type="spellStart"/>
+            <w:r>
+              <w:rPr>
+                <w:color w:val="2C3E50"/>
+                <w:sz w:val="20"/>
+                <w:szCs w:val="20"/>
+              </w:rPr>
+              <w:t>tradeoff</w:t>
+            </w:r>
+            <w:proofErr w:type="spellEnd"/>
+            <w:r>
+              <w:rPr>
+                <w:color w:val="2C3E50"/>
+                <w:sz w:val="20"/>
+                <w:szCs w:val="20"/>
+              </w:rPr>
+              <w:t xml:space="preserve"> analysis</w:t>
             </w:r>
           </w:p>
         </w:tc>
@@ -3992,7 +4405,6 @@
         <w:pStyle w:val="Heading2"/>
       </w:pPr>
       <w:r>
-        <w:lastRenderedPageBreak/>
         <w:t>5.3 Invalid Lead Times</w:t>
       </w:r>
     </w:p>
@@ -4195,8 +4607,9 @@
           <w:sz w:val="26"/>
           <w:szCs w:val="26"/>
         </w:rPr>
-        <w:t xml:space="preserve">Lead Time (days)  =  </w:t>
-      </w:r>
+        <w:t>Lead Time (</w:t>
+      </w:r>
+      <w:proofErr w:type="gramStart"/>
       <w:r>
         <w:rPr>
           <w:b/>
@@ -4205,8 +4618,9 @@
           <w:sz w:val="26"/>
           <w:szCs w:val="26"/>
         </w:rPr>
-        <w:t xml:space="preserve">Planned </w:t>
-      </w:r>
+        <w:t>days)  =</w:t>
+      </w:r>
+      <w:proofErr w:type="gramEnd"/>
       <w:r>
         <w:rPr>
           <w:b/>
@@ -4215,7 +4629,49 @@
           <w:sz w:val="26"/>
           <w:szCs w:val="26"/>
         </w:rPr>
-        <w:t>Ship Date  minus  Order Date</w:t>
+        <w:t xml:space="preserve">  </w:t>
+      </w:r>
+      <w:r>
+        <w:rPr>
+          <w:b/>
+          <w:bCs/>
+          <w:color w:val="2E75B6"/>
+          <w:sz w:val="26"/>
+          <w:szCs w:val="26"/>
+        </w:rPr>
+        <w:t xml:space="preserve">Planned </w:t>
+      </w:r>
+      <w:r>
+        <w:rPr>
+          <w:b/>
+          <w:bCs/>
+          <w:color w:val="2E75B6"/>
+          <w:sz w:val="26"/>
+          <w:szCs w:val="26"/>
+        </w:rPr>
+        <w:t xml:space="preserve">Ship </w:t>
+      </w:r>
+      <w:proofErr w:type="gramStart"/>
+      <w:r>
+        <w:rPr>
+          <w:b/>
+          <w:bCs/>
+          <w:color w:val="2E75B6"/>
+          <w:sz w:val="26"/>
+          <w:szCs w:val="26"/>
+        </w:rPr>
+        <w:t>Date  minus</w:t>
+      </w:r>
+      <w:proofErr w:type="gramEnd"/>
+      <w:r>
+        <w:rPr>
+          <w:b/>
+          <w:bCs/>
+          <w:color w:val="2E75B6"/>
+          <w:sz w:val="26"/>
+          <w:szCs w:val="26"/>
+        </w:rPr>
+        <w:t xml:space="preserve">  Order Date</w:t>
       </w:r>
     </w:p>
     <w:p>
@@ -4364,7 +4820,6 @@
                 <w:sz w:val="20"/>
                 <w:szCs w:val="20"/>
               </w:rPr>
-              <w:lastRenderedPageBreak/>
               <w:t>Factory</w:t>
             </w:r>
           </w:p>
@@ -4689,7 +5144,25 @@
                 <w:sz w:val="20"/>
                 <w:szCs w:val="20"/>
               </w:rPr>
-              <w:t>Laffy Taffy, SweeTARTS, Nerds, Fun Dip, Fizzy Lifting Drinks</w:t>
+              <w:t xml:space="preserve">Laffy Taffy, </w:t>
+            </w:r>
+            <w:proofErr w:type="spellStart"/>
+            <w:r>
+              <w:rPr>
+                <w:color w:val="2C3E50"/>
+                <w:sz w:val="20"/>
+                <w:szCs w:val="20"/>
+              </w:rPr>
+              <w:t>SweeTARTS</w:t>
+            </w:r>
+            <w:proofErr w:type="spellEnd"/>
+            <w:r>
+              <w:rPr>
+                <w:color w:val="2C3E50"/>
+                <w:sz w:val="20"/>
+                <w:szCs w:val="20"/>
+              </w:rPr>
+              <w:t>, Nerds, Fun Dip, Fizzy Lifting Drinks</w:t>
             </w:r>
           </w:p>
         </w:tc>
@@ -4861,8 +5334,18 @@
                 <w:sz w:val="20"/>
                 <w:szCs w:val="20"/>
               </w:rPr>
-              <w:t>Hair Toffee, Kazookles</w:t>
-            </w:r>
+              <w:t xml:space="preserve">Hair Toffee, </w:t>
+            </w:r>
+            <w:proofErr w:type="spellStart"/>
+            <w:r>
+              <w:rPr>
+                <w:color w:val="2C3E50"/>
+                <w:sz w:val="20"/>
+                <w:szCs w:val="20"/>
+              </w:rPr>
+              <w:t>Kazookles</w:t>
+            </w:r>
+            <w:proofErr w:type="spellEnd"/>
           </w:p>
         </w:tc>
       </w:tr>
@@ -4891,6 +5374,7 @@
         <w:spacing w:before="160" w:after="160"/>
         <w:jc w:val="center"/>
       </w:pPr>
+      <w:proofErr w:type="gramStart"/>
       <w:r>
         <w:rPr>
           <w:b/>
@@ -4899,7 +5383,40 @@
           <w:sz w:val="26"/>
           <w:szCs w:val="26"/>
         </w:rPr>
-        <w:t>Route  =  Factory Name  to  Customer State</w:t>
+        <w:t>Route  =</w:t>
+      </w:r>
+      <w:proofErr w:type="gramEnd"/>
+      <w:r>
+        <w:rPr>
+          <w:b/>
+          <w:bCs/>
+          <w:color w:val="2E75B6"/>
+          <w:sz w:val="26"/>
+          <w:szCs w:val="26"/>
+        </w:rPr>
+        <w:t xml:space="preserve">  Factory </w:t>
+      </w:r>
+      <w:proofErr w:type="gramStart"/>
+      <w:r>
+        <w:rPr>
+          <w:b/>
+          <w:bCs/>
+          <w:color w:val="2E75B6"/>
+          <w:sz w:val="26"/>
+          <w:szCs w:val="26"/>
+        </w:rPr>
+        <w:t>Name  to</w:t>
+      </w:r>
+      <w:proofErr w:type="gramEnd"/>
+      <w:r>
+        <w:rPr>
+          <w:b/>
+          <w:bCs/>
+          <w:color w:val="2E75B6"/>
+          <w:sz w:val="26"/>
+          <w:szCs w:val="26"/>
+        </w:rPr>
+        <w:t xml:space="preserve">  Customer State</w:t>
       </w:r>
     </w:p>
     <w:p>
@@ -4955,13 +5472,27 @@
         <w:rPr>
           <w:color w:val="2C3E50"/>
         </w:rPr>
-        <w:t>Lot's O' Nuts to California</w:t>
-      </w:r>
-      <w:r>
-        <w:rPr>
-          <w:color w:val="2C3E50"/>
-        </w:rPr>
-        <w:t>(highest order volume)</w:t>
+        <w:t xml:space="preserve">Lot's O' Nuts to </w:t>
+      </w:r>
+      <w:proofErr w:type="gramStart"/>
+      <w:r>
+        <w:rPr>
+          <w:color w:val="2C3E50"/>
+        </w:rPr>
+        <w:t>California</w:t>
+      </w:r>
+      <w:r>
+        <w:rPr>
+          <w:color w:val="2C3E50"/>
+        </w:rPr>
+        <w:t>(</w:t>
+      </w:r>
+      <w:proofErr w:type="gramEnd"/>
+      <w:r>
+        <w:rPr>
+          <w:color w:val="2C3E50"/>
+        </w:rPr>
+        <w:t>highest order volume)</w:t>
       </w:r>
     </w:p>
     <w:p>
@@ -5131,6 +5662,7 @@
             </w:tcMar>
           </w:tcPr>
           <w:p>
+            <w:proofErr w:type="gramStart"/>
             <w:r>
               <w:rPr>
                 <w:color w:val="2C3E50"/>
@@ -5145,7 +5677,16 @@
                 <w:sz w:val="20"/>
                 <w:szCs w:val="20"/>
               </w:rPr>
-              <w:t xml:space="preserve"> Planned </w:t>
+              <w:t xml:space="preserve"> Planned</w:t>
+            </w:r>
+            <w:proofErr w:type="gramEnd"/>
+            <w:r>
+              <w:rPr>
+                <w:color w:val="2C3E50"/>
+                <w:sz w:val="20"/>
+                <w:szCs w:val="20"/>
+              </w:rPr>
+              <w:t xml:space="preserve"> </w:t>
             </w:r>
             <w:r>
               <w:rPr>
@@ -5335,12 +5876,14 @@
             </w:tcMar>
           </w:tcPr>
           <w:p>
-            <w:r>
-              <w:rPr>
-                <w:color w:val="2C3E50"/>
-                <w:sz w:val="20"/>
-                <w:szCs w:val="20"/>
-              </w:rPr>
+            <w:proofErr w:type="gramStart"/>
+            <w:r>
+              <w:rPr>
+                <w:color w:val="2C3E50"/>
+                <w:sz w:val="20"/>
+                <w:szCs w:val="20"/>
+              </w:rPr>
+              <w:lastRenderedPageBreak/>
               <w:t xml:space="preserve">Average </w:t>
             </w:r>
             <w:r>
@@ -5349,7 +5892,16 @@
                 <w:sz w:val="20"/>
                 <w:szCs w:val="20"/>
               </w:rPr>
-              <w:t xml:space="preserve"> Planned </w:t>
+              <w:t xml:space="preserve"> Planned</w:t>
+            </w:r>
+            <w:proofErr w:type="gramEnd"/>
+            <w:r>
+              <w:rPr>
+                <w:color w:val="2C3E50"/>
+                <w:sz w:val="20"/>
+                <w:szCs w:val="20"/>
+              </w:rPr>
+              <w:t xml:space="preserve"> </w:t>
             </w:r>
             <w:r>
               <w:rPr>
@@ -5645,7 +6197,6 @@
         <w:pStyle w:val="Heading2"/>
       </w:pPr>
       <w:r>
-        <w:lastRenderedPageBreak/>
         <w:t>7.1 Lead Time Distribution</w:t>
       </w:r>
     </w:p>
@@ -5767,6 +6318,7 @@
         <w:rPr>
           <w:color w:val="2C3E50"/>
         </w:rPr>
+        <w:lastRenderedPageBreak/>
         <w:t>Around 1,600 days — approximately 3,400 orders in the delayed cluster</w:t>
       </w:r>
     </w:p>
@@ -5831,15 +6383,33 @@
           <w:bCs/>
           <w:color w:val="2C3E50"/>
         </w:rPr>
-        <w:t xml:space="preserve"> Planned </w:t>
-      </w:r>
+        <w:t xml:space="preserve"> </w:t>
+      </w:r>
+      <w:proofErr w:type="gramStart"/>
       <w:r>
         <w:rPr>
           <w:b/>
           <w:bCs/>
           <w:color w:val="2C3E50"/>
         </w:rPr>
-        <w:t xml:space="preserve"> Lead Time: </w:t>
+        <w:t xml:space="preserve">Planned </w:t>
+      </w:r>
+      <w:r>
+        <w:rPr>
+          <w:b/>
+          <w:bCs/>
+          <w:color w:val="2C3E50"/>
+        </w:rPr>
+        <w:t xml:space="preserve"> Lead</w:t>
+      </w:r>
+      <w:proofErr w:type="gramEnd"/>
+      <w:r>
+        <w:rPr>
+          <w:b/>
+          <w:bCs/>
+          <w:color w:val="2C3E50"/>
+        </w:rPr>
+        <w:t xml:space="preserve"> Time: </w:t>
       </w:r>
       <w:r>
         <w:rPr>
@@ -5899,7 +6469,6 @@
         <w:rPr>
           <w:color w:val="2C3E50"/>
         </w:rPr>
-        <w:lastRenderedPageBreak/>
         <w:t>After running the full analysis across 196 routes, 59 states and provinces, 4 regions, 5 factories, and 4 ship modes, here are the most important things we found:</w:t>
       </w:r>
     </w:p>
@@ -5910,11 +6479,35 @@
       <w:r>
         <w:t xml:space="preserve">   </w:t>
       </w:r>
+      <w:proofErr w:type="spellStart"/>
+      <w:proofErr w:type="gramStart"/>
       <w:r>
         <w:rPr>
           <w:highlight w:val="darkGray"/>
         </w:rPr>
-        <w:t>Note:Delay Drequency is Above-Average Delay Rate</w:t>
+        <w:t>Note:Delay</w:t>
+      </w:r>
+      <w:proofErr w:type="spellEnd"/>
+      <w:proofErr w:type="gramEnd"/>
+      <w:r>
+        <w:rPr>
+          <w:highlight w:val="darkGray"/>
+        </w:rPr>
+        <w:t xml:space="preserve"> </w:t>
+      </w:r>
+      <w:proofErr w:type="spellStart"/>
+      <w:r>
+        <w:rPr>
+          <w:highlight w:val="darkGray"/>
+        </w:rPr>
+        <w:t>Drequency</w:t>
+      </w:r>
+      <w:proofErr w:type="spellEnd"/>
+      <w:r>
+        <w:rPr>
+          <w:highlight w:val="darkGray"/>
+        </w:rPr>
+        <w:t xml:space="preserve"> is Above-Average Delay Rate</w:t>
       </w:r>
     </w:p>
     <w:p>
@@ -5974,15 +6567,7 @@
           <w:bCs/>
           <w:color w:val="2C3E50"/>
         </w:rPr>
-        <w:t xml:space="preserve">Planned </w:t>
-      </w:r>
-      <w:r>
-        <w:rPr>
-          <w:b/>
-          <w:bCs/>
-          <w:color w:val="2C3E50"/>
-        </w:rPr>
-        <w:t xml:space="preserve">Average Lead Time: </w:t>
+        <w:t xml:space="preserve">Planned Average Lead Time: </w:t>
       </w:r>
       <w:r>
         <w:rPr>
@@ -6093,15 +6678,7 @@
           <w:bCs/>
           <w:color w:val="2C3E50"/>
         </w:rPr>
-        <w:t xml:space="preserve">Planned </w:t>
-      </w:r>
-      <w:r>
-        <w:rPr>
-          <w:b/>
-          <w:bCs/>
-          <w:color w:val="2C3E50"/>
-        </w:rPr>
-        <w:t xml:space="preserve">Average Lead Time: </w:t>
+        <w:t xml:space="preserve">Planned Average Lead Time: </w:t>
       </w:r>
       <w:r>
         <w:rPr>
@@ -6192,15 +6769,16 @@
           <w:bCs/>
           <w:color w:val="2C3E50"/>
         </w:rPr>
-        <w:t>Most Delayed State</w:t>
-      </w:r>
+        <w:t xml:space="preserve">Most Delayed </w:t>
+      </w:r>
+      <w:proofErr w:type="gramStart"/>
       <w:r>
         <w:rPr>
           <w:b/>
           <w:bCs/>
           <w:color w:val="2C3E50"/>
         </w:rPr>
-        <w:t>(Planned)</w:t>
+        <w:t>State</w:t>
       </w:r>
       <w:r>
         <w:rPr>
@@ -6208,13 +6786,44 @@
           <w:bCs/>
           <w:color w:val="2C3E50"/>
         </w:rPr>
+        <w:t>(</w:t>
+      </w:r>
+      <w:proofErr w:type="gramEnd"/>
+      <w:r>
+        <w:rPr>
+          <w:b/>
+          <w:bCs/>
+          <w:color w:val="2C3E50"/>
+        </w:rPr>
+        <w:t>Planned)</w:t>
+      </w:r>
+      <w:r>
+        <w:rPr>
+          <w:b/>
+          <w:bCs/>
+          <w:color w:val="2C3E50"/>
+        </w:rPr>
         <w:t xml:space="preserve">: </w:t>
       </w:r>
       <w:r>
         <w:rPr>
           <w:color w:val="2C3E50"/>
         </w:rPr>
-        <w:t>West Virginia (Avg Lead Time: 1,638 days, 100% delay rate)</w:t>
+        <w:t>West Virginia (</w:t>
+      </w:r>
+      <w:proofErr w:type="spellStart"/>
+      <w:r>
+        <w:rPr>
+          <w:color w:val="2C3E50"/>
+        </w:rPr>
+        <w:t>Avg</w:t>
+      </w:r>
+      <w:proofErr w:type="spellEnd"/>
+      <w:r>
+        <w:rPr>
+          <w:color w:val="2C3E50"/>
+        </w:rPr>
+        <w:t xml:space="preserve"> Lead Time: 1,638 days, 100% delay rate)</w:t>
       </w:r>
     </w:p>
     <w:p>
@@ -6228,15 +6837,16 @@
           <w:bCs/>
           <w:color w:val="2C3E50"/>
         </w:rPr>
-        <w:t>Most Delayed Region</w:t>
-      </w:r>
+        <w:t xml:space="preserve">Most Delayed </w:t>
+      </w:r>
+      <w:proofErr w:type="gramStart"/>
       <w:r>
         <w:rPr>
           <w:b/>
           <w:bCs/>
           <w:color w:val="2C3E50"/>
         </w:rPr>
-        <w:t>(Planned)</w:t>
+        <w:t>Region</w:t>
       </w:r>
       <w:r>
         <w:rPr>
@@ -6244,13 +6854,44 @@
           <w:bCs/>
           <w:color w:val="2C3E50"/>
         </w:rPr>
+        <w:t>(</w:t>
+      </w:r>
+      <w:proofErr w:type="gramEnd"/>
+      <w:r>
+        <w:rPr>
+          <w:b/>
+          <w:bCs/>
+          <w:color w:val="2C3E50"/>
+        </w:rPr>
+        <w:t>Planned)</w:t>
+      </w:r>
+      <w:r>
+        <w:rPr>
+          <w:b/>
+          <w:bCs/>
+          <w:color w:val="2C3E50"/>
+        </w:rPr>
         <w:t xml:space="preserve">: </w:t>
       </w:r>
       <w:r>
         <w:rPr>
           <w:color w:val="2C3E50"/>
         </w:rPr>
-        <w:t>Interior (Avg Lead Time: 1,323 days, 33.58% delay rate)</w:t>
+        <w:t>Interior (</w:t>
+      </w:r>
+      <w:proofErr w:type="spellStart"/>
+      <w:r>
+        <w:rPr>
+          <w:color w:val="2C3E50"/>
+        </w:rPr>
+        <w:t>Avg</w:t>
+      </w:r>
+      <w:proofErr w:type="spellEnd"/>
+      <w:r>
+        <w:rPr>
+          <w:color w:val="2C3E50"/>
+        </w:rPr>
+        <w:t xml:space="preserve"> Lead Time: 1,323 days, 33.58% delay rate)</w:t>
       </w:r>
     </w:p>
     <w:p>
@@ -6270,7 +6911,21 @@
         <w:rPr>
           <w:color w:val="2C3E50"/>
         </w:rPr>
-        <w:t>Gulf (Avg Lead Time: 1,311 days, 31.98% delay rate)</w:t>
+        <w:t>Gulf (</w:t>
+      </w:r>
+      <w:proofErr w:type="spellStart"/>
+      <w:r>
+        <w:rPr>
+          <w:color w:val="2C3E50"/>
+        </w:rPr>
+        <w:t>Avg</w:t>
+      </w:r>
+      <w:proofErr w:type="spellEnd"/>
+      <w:r>
+        <w:rPr>
+          <w:color w:val="2C3E50"/>
+        </w:rPr>
+        <w:t xml:space="preserve"> Lead Time: 1,311 days, 31.98% delay rate)</w:t>
       </w:r>
     </w:p>
     <w:p>
@@ -6375,6 +7030,7 @@
           <w:bCs/>
           <w:color w:val="2C3E50"/>
         </w:rPr>
+        <w:lastRenderedPageBreak/>
         <w:t xml:space="preserve">Key Insight: </w:t>
       </w:r>
       <w:r>
@@ -6505,7 +7161,15 @@
         <w:pStyle w:val="Heading2"/>
       </w:pPr>
       <w:r>
-        <w:t>8.6 Ship Mode Cost-Time Tradeoff Analysis</w:t>
+        <w:t xml:space="preserve">8.6 Ship Mode Cost-Time </w:t>
+      </w:r>
+      <w:proofErr w:type="spellStart"/>
+      <w:r>
+        <w:t>Tradeoff</w:t>
+      </w:r>
+      <w:proofErr w:type="spellEnd"/>
+      <w:r>
+        <w:t xml:space="preserve"> Analysis</w:t>
       </w:r>
     </w:p>
     <w:p>
@@ -6516,8 +7180,21 @@
         <w:rPr>
           <w:color w:val="2C3E50"/>
         </w:rPr>
-        <w:lastRenderedPageBreak/>
-        <w:t>One of the requirements of this analysis was to evaluate cost-time tradeoffs across shipping methods. In other words — are customers getting what they pay for? Is a more expensive ship mode actually faster?</w:t>
+        <w:t xml:space="preserve">One of the requirements of this analysis was to evaluate cost-time </w:t>
+      </w:r>
+      <w:proofErr w:type="spellStart"/>
+      <w:r>
+        <w:rPr>
+          <w:color w:val="2C3E50"/>
+        </w:rPr>
+        <w:t>tradeoffs</w:t>
+      </w:r>
+      <w:proofErr w:type="spellEnd"/>
+      <w:r>
+        <w:rPr>
+          <w:color w:val="2C3E50"/>
+        </w:rPr>
+        <w:t xml:space="preserve"> across shipping methods. In other words — are customers getting what they pay for? Is a more expensive ship mode actually faster?</w:t>
       </w:r>
     </w:p>
     <w:p>
@@ -6640,6 +7317,7 @@
             <w:pPr>
               <w:jc w:val="center"/>
             </w:pPr>
+            <w:proofErr w:type="spellStart"/>
             <w:r>
               <w:rPr>
                 <w:b/>
@@ -6648,7 +7326,18 @@
                 <w:sz w:val="20"/>
                 <w:szCs w:val="20"/>
               </w:rPr>
-              <w:t>Avg Lead Time (Days)</w:t>
+              <w:t>Avg</w:t>
+            </w:r>
+            <w:proofErr w:type="spellEnd"/>
+            <w:r>
+              <w:rPr>
+                <w:b/>
+                <w:bCs/>
+                <w:color w:val="FFFFFF"/>
+                <w:sz w:val="20"/>
+                <w:szCs w:val="20"/>
+              </w:rPr>
+              <w:t xml:space="preserve"> Lead Time (Days)</w:t>
             </w:r>
           </w:p>
         </w:tc>
@@ -6673,6 +7362,7 @@
             <w:pPr>
               <w:jc w:val="center"/>
             </w:pPr>
+            <w:proofErr w:type="spellStart"/>
             <w:r>
               <w:rPr>
                 <w:b/>
@@ -6681,7 +7371,18 @@
                 <w:sz w:val="20"/>
                 <w:szCs w:val="20"/>
               </w:rPr>
-              <w:t>Avg Cost ($)</w:t>
+              <w:t>Avg</w:t>
+            </w:r>
+            <w:proofErr w:type="spellEnd"/>
+            <w:r>
+              <w:rPr>
+                <w:b/>
+                <w:bCs/>
+                <w:color w:val="FFFFFF"/>
+                <w:sz w:val="20"/>
+                <w:szCs w:val="20"/>
+              </w:rPr>
+              <w:t xml:space="preserve"> Cost ($)</w:t>
             </w:r>
           </w:p>
         </w:tc>
@@ -6706,6 +7407,7 @@
             <w:pPr>
               <w:jc w:val="center"/>
             </w:pPr>
+            <w:proofErr w:type="spellStart"/>
             <w:r>
               <w:rPr>
                 <w:b/>
@@ -6714,7 +7416,18 @@
                 <w:sz w:val="20"/>
                 <w:szCs w:val="20"/>
               </w:rPr>
-              <w:t>Avg Gross Profit ($)</w:t>
+              <w:t>Avg</w:t>
+            </w:r>
+            <w:proofErr w:type="spellEnd"/>
+            <w:r>
+              <w:rPr>
+                <w:b/>
+                <w:bCs/>
+                <w:color w:val="FFFFFF"/>
+                <w:sz w:val="20"/>
+                <w:szCs w:val="20"/>
+              </w:rPr>
+              <w:t xml:space="preserve"> Gross Profit ($)</w:t>
             </w:r>
           </w:p>
         </w:tc>
@@ -7374,6 +8087,7 @@
         <w:rPr>
           <w:color w:val="2C3E50"/>
         </w:rPr>
+        <w:lastRenderedPageBreak/>
         <w:t>Same Day shipping is interesting — it has the lowest cost at $4.41 per order but also the lowest gross profit at $8.59. This suggests that Same Day orders tend to be smaller or less profitable orders overall.</w:t>
       </w:r>
     </w:p>
@@ -7397,7 +8111,25 @@
           <w:iCs/>
           <w:color w:val="2C3E50"/>
         </w:rPr>
-        <w:t>The business takeaway here is simple — Standard Class is not just the most popular choice, it is genuinely the smartest choice. Nassau Candy should continue prioritizing Standard Class across its network while investigating why First Class is underperforming on delivery speed despite its premium positioning.</w:t>
+        <w:t xml:space="preserve">The business takeaway here is simple — Standard Class is not just the most popular </w:t>
+      </w:r>
+      <w:proofErr w:type="gramStart"/>
+      <w:r>
+        <w:rPr>
+          <w:i/>
+          <w:iCs/>
+          <w:color w:val="2C3E50"/>
+        </w:rPr>
+        <w:t>choice,</w:t>
+      </w:r>
+      <w:proofErr w:type="gramEnd"/>
+      <w:r>
+        <w:rPr>
+          <w:i/>
+          <w:iCs/>
+          <w:color w:val="2C3E50"/>
+        </w:rPr>
+        <w:t xml:space="preserve"> it is genuinely the smartest choice. Nassau Candy should continue prioritizing Standard Class across its network while investigating why First Class is underperforming on delivery speed despite its premium positioning.</w:t>
       </w:r>
     </w:p>
     <w:p>
@@ -7487,7 +8219,21 @@
         <w:rPr>
           <w:color w:val="2C3E50"/>
         </w:rPr>
-        <w:t>Investigate why First Class shipping is slower than Standard Class. Customers paying for First Class expect faster delivery — but the data shows they are getting the slowest delivery in the network. This is a service quality and brand trust issue that needs to be addressed urgently.</w:t>
+        <w:t xml:space="preserve">Investigate why </w:t>
+      </w:r>
+      <w:proofErr w:type="gramStart"/>
+      <w:r>
+        <w:rPr>
+          <w:color w:val="2C3E50"/>
+        </w:rPr>
+        <w:t>First Class</w:t>
+      </w:r>
+      <w:proofErr w:type="gramEnd"/>
+      <w:r>
+        <w:rPr>
+          <w:color w:val="2C3E50"/>
+        </w:rPr>
+        <w:t xml:space="preserve"> shipping is slower than Standard Class. Customers paying for First Class expect faster delivery — but the data shows they are getting the slowest delivery in the network. This is a service quality and brand trust issue that needs to be addressed urgently.</w:t>
       </w:r>
     </w:p>
     <w:p>
@@ -7529,7 +8275,21 @@
         <w:rPr>
           <w:color w:val="2C3E50"/>
         </w:rPr>
-        <w:t>Use the Streamlit dashboard for ongoing monitoring. The interactive dashboard built alongside this report allows the logistics team to monitor route performance in real time, filter by region, state, ship mode, and lead time threshold, and catch emerging bottlenecks before they impact customers.</w:t>
+        <w:t xml:space="preserve">Use the </w:t>
+      </w:r>
+      <w:proofErr w:type="spellStart"/>
+      <w:r>
+        <w:rPr>
+          <w:color w:val="2C3E50"/>
+        </w:rPr>
+        <w:t>Streamlit</w:t>
+      </w:r>
+      <w:proofErr w:type="spellEnd"/>
+      <w:r>
+        <w:rPr>
+          <w:color w:val="2C3E50"/>
+        </w:rPr>
+        <w:t xml:space="preserve"> dashboard for ongoing monitoring. The interactive dashboard built alongside this report allows the logistics team to monitor route performance in real time, filter by region, state, ship mode, and lead time threshold, and catch emerging bottlenecks before they impact customers.</w:t>
       </w:r>
     </w:p>
     <w:p>
@@ -7558,13 +8318,28 @@
         <w:rPr>
           <w:color w:val="2C3E50"/>
         </w:rPr>
-        <w:t>Ship Dates in this dataset represent planned future delivery dates</w:t>
-      </w:r>
-      <w:r>
-        <w:rPr>
-          <w:color w:val="2C3E50"/>
-        </w:rPr>
-        <w:t>(2026-2030)</w:t>
+        <w:lastRenderedPageBreak/>
+        <w:t xml:space="preserve">Ship Dates in this dataset represent planned future delivery </w:t>
+      </w:r>
+      <w:proofErr w:type="gramStart"/>
+      <w:r>
+        <w:rPr>
+          <w:color w:val="2C3E50"/>
+        </w:rPr>
+        <w:t>dates</w:t>
+      </w:r>
+      <w:r>
+        <w:rPr>
+          <w:color w:val="2C3E50"/>
+        </w:rPr>
+        <w:t>(</w:t>
+      </w:r>
+      <w:proofErr w:type="gramEnd"/>
+      <w:r>
+        <w:rPr>
+          <w:color w:val="2C3E50"/>
+        </w:rPr>
+        <w:t>2026-2030)</w:t>
       </w:r>
       <w:r>
         <w:rPr>
@@ -7618,7 +8393,21 @@
         <w:rPr>
           <w:color w:val="2C3E50"/>
         </w:rPr>
-        <w:t>Factory coordinates were sourced from geographic reference data as approximate center points of each factory location.</w:t>
+        <w:t xml:space="preserve">Factory coordinates were sourced from geographic reference data as approximate </w:t>
+      </w:r>
+      <w:proofErr w:type="spellStart"/>
+      <w:r>
+        <w:rPr>
+          <w:color w:val="2C3E50"/>
+        </w:rPr>
+        <w:t>center</w:t>
+      </w:r>
+      <w:proofErr w:type="spellEnd"/>
+      <w:r>
+        <w:rPr>
+          <w:color w:val="2C3E50"/>
+        </w:rPr>
+        <w:t xml:space="preserve"> points of each factory location.</w:t>
       </w:r>
     </w:p>
     <w:p>
@@ -7668,8 +8457,14 @@
         <w:rPr>
           <w:color w:val="2C3E50"/>
         </w:rPr>
-        <w:lastRenderedPageBreak/>
-        <w:t>This analysis set out to answer a straightforward question — how well is Nassau Candy Distributor's shipping network actually performing? After examining  10,</w:t>
+        <w:t xml:space="preserve">This analysis set out to answer a straightforward question — how well is Nassau Candy Distributor's shipping network actually performing? After </w:t>
+      </w:r>
+      <w:proofErr w:type="gramStart"/>
+      <w:r>
+        <w:rPr>
+          <w:color w:val="2C3E50"/>
+        </w:rPr>
+        <w:t>examining  10,</w:t>
       </w:r>
       <w:r>
         <w:rPr>
@@ -7677,6 +8472,7 @@
         </w:rPr>
         <w:t>194</w:t>
       </w:r>
+      <w:proofErr w:type="gramEnd"/>
       <w:r>
         <w:rPr>
           <w:color w:val="2C3E50"/>
@@ -7713,7 +8509,21 @@
         <w:rPr>
           <w:color w:val="2C3E50"/>
         </w:rPr>
-        <w:t>The cost-time tradeoff analysis also revealed something unexpected — Standard Class, the cheapest and most commonly used option, is actually the fastest. First Class, the premium option, is the slowest. This misalignment between price and performance is something Nassau Candy needs to address immediately.</w:t>
+        <w:t xml:space="preserve">The cost-time </w:t>
+      </w:r>
+      <w:proofErr w:type="spellStart"/>
+      <w:r>
+        <w:rPr>
+          <w:color w:val="2C3E50"/>
+        </w:rPr>
+        <w:t>tradeoff</w:t>
+      </w:r>
+      <w:proofErr w:type="spellEnd"/>
+      <w:r>
+        <w:rPr>
+          <w:color w:val="2C3E50"/>
+        </w:rPr>
+        <w:t xml:space="preserve"> analysis also revealed something unexpected — Standard Class, the cheapest and most commonly used option, is actually the fastest. First Class, the premium option, is the slowest. This misalignment between price and performance is something Nassau Candy needs to address immediately.</w:t>
       </w:r>
     </w:p>
     <w:p>
@@ -7782,7 +8592,21 @@
         <w:rPr>
           <w:color w:val="2C3E50"/>
         </w:rPr>
-        <w:t>Fix the First Class performance gap to deliver on customer expectations</w:t>
+        <w:t xml:space="preserve">Fix the </w:t>
+      </w:r>
+      <w:proofErr w:type="gramStart"/>
+      <w:r>
+        <w:rPr>
+          <w:color w:val="2C3E50"/>
+        </w:rPr>
+        <w:t>First Class</w:t>
+      </w:r>
+      <w:proofErr w:type="gramEnd"/>
+      <w:r>
+        <w:rPr>
+          <w:color w:val="2C3E50"/>
+        </w:rPr>
+        <w:t xml:space="preserve"> performance gap to deliver on customer expectations</w:t>
       </w:r>
     </w:p>
     <w:p>
@@ -7798,7 +8622,21 @@
         <w:rPr>
           <w:color w:val="2C3E50"/>
         </w:rPr>
-        <w:t>Track progress over time using the interactive Streamlit dashboard</w:t>
+        <w:t xml:space="preserve">Track progress over time using the interactive </w:t>
+      </w:r>
+      <w:proofErr w:type="spellStart"/>
+      <w:r>
+        <w:rPr>
+          <w:color w:val="2C3E50"/>
+        </w:rPr>
+        <w:t>Streamlit</w:t>
+      </w:r>
+      <w:proofErr w:type="spellEnd"/>
+      <w:r>
+        <w:rPr>
+          <w:color w:val="2C3E50"/>
+        </w:rPr>
+        <w:t xml:space="preserve"> dashboard</w:t>
       </w:r>
     </w:p>
     <w:p>
@@ -7857,7 +8695,61 @@
           <w:sz w:val="18"/>
           <w:szCs w:val="18"/>
         </w:rPr>
-        <w:t>Nassau Candy Distributor  |  Data Analytics Internship  |  MD ASJAD ALAM  |  April 2026</w:t>
+        <w:t xml:space="preserve">Nassau Candy </w:t>
+      </w:r>
+      <w:proofErr w:type="gramStart"/>
+      <w:r>
+        <w:rPr>
+          <w:color w:val="AAAAAA"/>
+          <w:sz w:val="18"/>
+          <w:szCs w:val="18"/>
+        </w:rPr>
+        <w:t>Distributor  |</w:t>
+      </w:r>
+      <w:proofErr w:type="gramEnd"/>
+      <w:r>
+        <w:rPr>
+          <w:color w:val="AAAAAA"/>
+          <w:sz w:val="18"/>
+          <w:szCs w:val="18"/>
+        </w:rPr>
+        <w:t xml:space="preserve">  Data Analytics </w:t>
+      </w:r>
+      <w:proofErr w:type="gramStart"/>
+      <w:r>
+        <w:rPr>
+          <w:color w:val="AAAAAA"/>
+          <w:sz w:val="18"/>
+          <w:szCs w:val="18"/>
+        </w:rPr>
+        <w:t>Internship  |</w:t>
+      </w:r>
+      <w:proofErr w:type="gramEnd"/>
+      <w:r>
+        <w:rPr>
+          <w:color w:val="AAAAAA"/>
+          <w:sz w:val="18"/>
+          <w:szCs w:val="18"/>
+        </w:rPr>
+        <w:t xml:space="preserve">  MD ASJAD </w:t>
+      </w:r>
+      <w:proofErr w:type="gramStart"/>
+      <w:r>
+        <w:rPr>
+          <w:color w:val="AAAAAA"/>
+          <w:sz w:val="18"/>
+          <w:szCs w:val="18"/>
+        </w:rPr>
+        <w:t>ALAM  |</w:t>
+      </w:r>
+      <w:proofErr w:type="gramEnd"/>
+      <w:r>
+        <w:rPr>
+          <w:color w:val="AAAAAA"/>
+          <w:sz w:val="18"/>
+          <w:szCs w:val="18"/>
+        </w:rPr>
+        <w:t xml:space="preserve">  April 2026</w:t>
       </w:r>
     </w:p>
     <w:sectPr>
@@ -7905,7 +8797,43 @@
         <w:sz w:val="18"/>
         <w:szCs w:val="18"/>
       </w:rPr>
-      <w:t xml:space="preserve">Nassau Candy Distributor  |  Shipping Route Efficiency Analysis  |  Page </w:t>
+      <w:t xml:space="preserve">Nassau Candy </w:t>
+    </w:r>
+    <w:proofErr w:type="gramStart"/>
+    <w:r>
+      <w:rPr>
+        <w:color w:val="888888"/>
+        <w:sz w:val="18"/>
+        <w:szCs w:val="18"/>
+      </w:rPr>
+      <w:t>Distributor  |</w:t>
+    </w:r>
+    <w:proofErr w:type="gramEnd"/>
+    <w:r>
+      <w:rPr>
+        <w:color w:val="888888"/>
+        <w:sz w:val="18"/>
+        <w:szCs w:val="18"/>
+      </w:rPr>
+      <w:t xml:space="preserve">  Shipping Route Efficiency </w:t>
+    </w:r>
+    <w:proofErr w:type="gramStart"/>
+    <w:r>
+      <w:rPr>
+        <w:color w:val="888888"/>
+        <w:sz w:val="18"/>
+        <w:szCs w:val="18"/>
+      </w:rPr>
+      <w:t>Analysis  |</w:t>
+    </w:r>
+    <w:proofErr w:type="gramEnd"/>
+    <w:r>
+      <w:rPr>
+        <w:color w:val="888888"/>
+        <w:sz w:val="18"/>
+        <w:szCs w:val="18"/>
+      </w:rPr>
+      <w:t xml:space="preserve">  Page </w:t>
     </w:r>
     <w:r>
       <w:rPr>
@@ -8427,15 +9355,6 @@
   </w:num>
   <w:num w:numId="4" w16cid:durableId="1487866211">
     <w:abstractNumId w:val="1"/>
-    <w:lvlOverride w:ilvl="0"/>
-    <w:lvlOverride w:ilvl="1"/>
-    <w:lvlOverride w:ilvl="2"/>
-    <w:lvlOverride w:ilvl="3"/>
-    <w:lvlOverride w:ilvl="4"/>
-    <w:lvlOverride w:ilvl="5"/>
-    <w:lvlOverride w:ilvl="6"/>
-    <w:lvlOverride w:ilvl="7"/>
-    <w:lvlOverride w:ilvl="8"/>
   </w:num>
   <w:num w:numId="5" w16cid:durableId="752362185">
     <w:abstractNumId w:val="2"/>
@@ -8930,6 +9849,7 @@
   <w:style w:type="character" w:default="1" w:styleId="DefaultParagraphFont">
     <w:name w:val="Default Paragraph Font"/>
     <w:uiPriority w:val="1"/>
+    <w:semiHidden/>
     <w:unhideWhenUsed/>
   </w:style>
   <w:style w:type="table" w:default="1" w:styleId="TableNormal">

</xml_diff>